<commit_message>
modify exam01 word file
</commit_message>
<xml_diff>
--- a/exam01/01_파이썬기반 데이터 분석 및 시각화_정시평가.docx
+++ b/exam01/01_파이썬기반 데이터 분석 및 시각화_정시평가.docx
@@ -6045,6 +6045,37 @@
           </w:p>
         </w:tc>
       </w:tr>
+    </w:tbl>
+    <w:p>
+      <w:r>
+        <w:br w:type="page"/>
+      </w:r>
+    </w:p>
+    <w:tbl>
+      <w:tblPr>
+        <w:tblOverlap w:val="never"/>
+        <w:tblW w:w="9902" w:type="dxa"/>
+        <w:tblInd w:w="102" w:type="dxa"/>
+        <w:tblBorders>
+          <w:top w:val="single" w:sz="4" w:space="0" w:color="000000"/>
+          <w:left w:val="single" w:sz="4" w:space="0" w:color="000000"/>
+          <w:bottom w:val="single" w:sz="4" w:space="0" w:color="000000"/>
+          <w:right w:val="single" w:sz="4" w:space="0" w:color="000000"/>
+          <w:insideH w:val="single" w:sz="4" w:space="0" w:color="000000"/>
+          <w:insideV w:val="single" w:sz="4" w:space="0" w:color="000000"/>
+        </w:tblBorders>
+        <w:tblLayout w:type="fixed"/>
+        <w:tblCellMar>
+          <w:top w:w="57" w:type="dxa"/>
+          <w:left w:w="102" w:type="dxa"/>
+          <w:bottom w:w="57" w:type="dxa"/>
+          <w:right w:w="102" w:type="dxa"/>
+        </w:tblCellMar>
+        <w:tblLook w:val="04A0" w:firstRow="1" w:lastRow="0" w:firstColumn="1" w:lastColumn="0" w:noHBand="0" w:noVBand="1"/>
+      </w:tblPr>
+      <w:tblGrid>
+        <w:gridCol w:w="9902"/>
+      </w:tblGrid>
       <w:tr>
         <w:trPr>
           <w:trHeight w:val="14763"/>
@@ -6052,7 +6083,6 @@
         <w:tc>
           <w:tcPr>
             <w:tcW w:w="9902" w:type="dxa"/>
-            <w:gridSpan w:val="3"/>
           </w:tcPr>
           <w:p>
             <w:pPr>
@@ -7321,7 +7351,7 @@
               <w:pStyle w:val="a3"/>
               <w:spacing w:line="312" w:lineRule="auto"/>
               <w:rPr>
-                <w:rFonts w:ascii="맑은 고딕" w:eastAsia="맑은 고딕" w:hint="eastAsia"/>
+                <w:rFonts w:ascii="맑은 고딕" w:eastAsia="맑은 고딕"/>
                 <w:b/>
                 <w:sz w:val="18"/>
               </w:rPr>
@@ -7341,6 +7371,59 @@
               <w:pStyle w:val="a3"/>
               <w:spacing w:line="312" w:lineRule="auto"/>
               <w:rPr>
+                <w:rFonts w:ascii="맑은 고딕" w:eastAsia="맑은 고딕" w:hint="eastAsia"/>
+                <w:b/>
+                <w:sz w:val="18"/>
+              </w:rPr>
+            </w:pPr>
+            <w:r>
+              <w:rPr>
+                <w:rFonts w:ascii="맑은 고딕" w:eastAsia="맑은 고딕" w:hint="eastAsia"/>
+                <w:b/>
+                <w:sz w:val="18"/>
+              </w:rPr>
+              <w:t xml:space="preserve">(후에 엑셀 파일을 열기 위한 </w:t>
+            </w:r>
+            <w:proofErr w:type="spellStart"/>
+            <w:r>
+              <w:rPr>
+                <w:rFonts w:ascii="맑은 고딕" w:eastAsia="맑은 고딕"/>
+                <w:b/>
+                <w:sz w:val="18"/>
+              </w:rPr>
+              <w:t>openpyxl</w:t>
+            </w:r>
+            <w:proofErr w:type="spellEnd"/>
+            <w:r>
+              <w:rPr>
+                <w:rFonts w:ascii="맑은 고딕" w:eastAsia="맑은 고딕"/>
+                <w:b/>
+                <w:sz w:val="18"/>
+              </w:rPr>
+              <w:t xml:space="preserve"> </w:t>
+            </w:r>
+            <w:r>
+              <w:rPr>
+                <w:rFonts w:ascii="맑은 고딕" w:eastAsia="맑은 고딕" w:hint="eastAsia"/>
+                <w:b/>
+                <w:sz w:val="18"/>
+              </w:rPr>
+              <w:t>라이브러리도 설치했습니다</w:t>
+            </w:r>
+            <w:r>
+              <w:rPr>
+                <w:rFonts w:ascii="맑은 고딕" w:eastAsia="맑은 고딕"/>
+                <w:b/>
+                <w:sz w:val="18"/>
+              </w:rPr>
+              <w:t>.)</w:t>
+            </w:r>
+          </w:p>
+          <w:p>
+            <w:pPr>
+              <w:pStyle w:val="a3"/>
+              <w:spacing w:line="312" w:lineRule="auto"/>
+              <w:rPr>
                 <w:rFonts w:ascii="맑은 고딕" w:eastAsia="맑은 고딕"/>
                 <w:b/>
                 <w:sz w:val="18"/>
@@ -7464,9 +7547,9 @@
                 <w:sz w:val="18"/>
               </w:rPr>
               <w:drawing>
-                <wp:inline distT="0" distB="0" distL="0" distR="0" wp14:anchorId="2BCA8F82" wp14:editId="3E8B31C1">
-                  <wp:extent cx="6153150" cy="1114425"/>
-                  <wp:effectExtent l="0" t="0" r="0" b="9525"/>
+                <wp:inline distT="0" distB="0" distL="0" distR="0" wp14:anchorId="2BCA8F82" wp14:editId="73ED8B17">
+                  <wp:extent cx="6058485" cy="1097280"/>
+                  <wp:effectExtent l="0" t="0" r="0" b="7620"/>
                   <wp:docPr id="3" name="그림 3"/>
                   <wp:cNvGraphicFramePr>
                     <a:graphicFrameLocks xmlns:a="http://schemas.openxmlformats.org/drawingml/2006/main" noChangeAspect="1"/>
@@ -7496,7 +7579,7 @@
                         <pic:spPr bwMode="auto">
                           <a:xfrm>
                             <a:off x="0" y="0"/>
-                            <a:ext cx="6153150" cy="1114425"/>
+                            <a:ext cx="6133752" cy="1110912"/>
                           </a:xfrm>
                           <a:prstGeom prst="rect">
                             <a:avLst/>
@@ -7801,9 +7884,9 @@
                 <w:sz w:val="18"/>
               </w:rPr>
               <w:drawing>
-                <wp:inline distT="0" distB="0" distL="0" distR="0" wp14:anchorId="36B93131" wp14:editId="69148B4A">
-                  <wp:extent cx="5695950" cy="1123950"/>
-                  <wp:effectExtent l="0" t="0" r="0" b="0"/>
+                <wp:inline distT="0" distB="0" distL="0" distR="0" wp14:anchorId="36B93131" wp14:editId="506E15B6">
+                  <wp:extent cx="4047213" cy="798614"/>
+                  <wp:effectExtent l="0" t="0" r="0" b="1905"/>
                   <wp:docPr id="7" name="그림 7"/>
                   <wp:cNvGraphicFramePr>
                     <a:graphicFrameLocks xmlns:a="http://schemas.openxmlformats.org/drawingml/2006/main" noChangeAspect="1"/>
@@ -7833,7 +7916,7 @@
                         <pic:spPr bwMode="auto">
                           <a:xfrm>
                             <a:off x="0" y="0"/>
-                            <a:ext cx="5695950" cy="1123950"/>
+                            <a:ext cx="4059544" cy="801047"/>
                           </a:xfrm>
                           <a:prstGeom prst="rect">
                             <a:avLst/>
@@ -7857,9 +7940,9 @@
                 <w:sz w:val="18"/>
               </w:rPr>
               <w:drawing>
-                <wp:inline distT="0" distB="0" distL="0" distR="0" wp14:anchorId="7004D731" wp14:editId="04C06179">
-                  <wp:extent cx="5724525" cy="609600"/>
-                  <wp:effectExtent l="0" t="0" r="9525" b="0"/>
+                <wp:inline distT="0" distB="0" distL="0" distR="0" wp14:anchorId="7004D731" wp14:editId="38977A5C">
+                  <wp:extent cx="5301414" cy="564543"/>
+                  <wp:effectExtent l="0" t="0" r="0" b="6985"/>
                   <wp:docPr id="8" name="그림 8"/>
                   <wp:cNvGraphicFramePr>
                     <a:graphicFrameLocks xmlns:a="http://schemas.openxmlformats.org/drawingml/2006/main" noChangeAspect="1"/>
@@ -7889,7 +7972,7 @@
                         <pic:spPr bwMode="auto">
                           <a:xfrm>
                             <a:off x="0" y="0"/>
-                            <a:ext cx="5724525" cy="609600"/>
+                            <a:ext cx="5331137" cy="567708"/>
                           </a:xfrm>
                           <a:prstGeom prst="rect">
                             <a:avLst/>
@@ -8006,6 +8089,94 @@
               <w:pStyle w:val="a3"/>
               <w:spacing w:line="312" w:lineRule="auto"/>
               <w:rPr>
+                <w:rFonts w:ascii="맑은 고딕" w:eastAsia="맑은 고딕"/>
+                <w:b/>
+                <w:sz w:val="18"/>
+              </w:rPr>
+            </w:pPr>
+          </w:p>
+          <w:p>
+            <w:pPr>
+              <w:pStyle w:val="a3"/>
+              <w:spacing w:line="312" w:lineRule="auto"/>
+              <w:rPr>
+                <w:rFonts w:ascii="맑은 고딕" w:eastAsia="맑은 고딕"/>
+                <w:b/>
+                <w:sz w:val="18"/>
+              </w:rPr>
+            </w:pPr>
+          </w:p>
+          <w:p>
+            <w:pPr>
+              <w:pStyle w:val="a3"/>
+              <w:spacing w:line="312" w:lineRule="auto"/>
+              <w:rPr>
+                <w:rFonts w:ascii="맑은 고딕" w:eastAsia="맑은 고딕"/>
+                <w:b/>
+                <w:sz w:val="18"/>
+              </w:rPr>
+            </w:pPr>
+          </w:p>
+          <w:p>
+            <w:pPr>
+              <w:pStyle w:val="a3"/>
+              <w:spacing w:line="312" w:lineRule="auto"/>
+              <w:rPr>
+                <w:rFonts w:ascii="맑은 고딕" w:eastAsia="맑은 고딕"/>
+                <w:b/>
+                <w:sz w:val="18"/>
+              </w:rPr>
+            </w:pPr>
+          </w:p>
+          <w:p>
+            <w:pPr>
+              <w:pStyle w:val="a3"/>
+              <w:spacing w:line="312" w:lineRule="auto"/>
+              <w:rPr>
+                <w:rFonts w:ascii="맑은 고딕" w:eastAsia="맑은 고딕"/>
+                <w:b/>
+                <w:sz w:val="18"/>
+              </w:rPr>
+            </w:pPr>
+          </w:p>
+          <w:p>
+            <w:pPr>
+              <w:pStyle w:val="a3"/>
+              <w:spacing w:line="312" w:lineRule="auto"/>
+              <w:rPr>
+                <w:rFonts w:ascii="맑은 고딕" w:eastAsia="맑은 고딕"/>
+                <w:b/>
+                <w:sz w:val="18"/>
+              </w:rPr>
+            </w:pPr>
+          </w:p>
+          <w:p>
+            <w:pPr>
+              <w:pStyle w:val="a3"/>
+              <w:spacing w:line="312" w:lineRule="auto"/>
+              <w:rPr>
+                <w:rFonts w:ascii="맑은 고딕" w:eastAsia="맑은 고딕"/>
+                <w:b/>
+                <w:sz w:val="18"/>
+              </w:rPr>
+            </w:pPr>
+          </w:p>
+          <w:p>
+            <w:pPr>
+              <w:pStyle w:val="a3"/>
+              <w:spacing w:line="312" w:lineRule="auto"/>
+              <w:rPr>
+                <w:rFonts w:ascii="맑은 고딕" w:eastAsia="맑은 고딕"/>
+                <w:b/>
+                <w:sz w:val="18"/>
+              </w:rPr>
+            </w:pPr>
+          </w:p>
+          <w:p>
+            <w:pPr>
+              <w:pStyle w:val="a3"/>
+              <w:spacing w:line="312" w:lineRule="auto"/>
+              <w:rPr>
                 <w:rFonts w:ascii="맑은 고딕" w:eastAsia="맑은 고딕" w:hint="eastAsia"/>
                 <w:b/>
                 <w:sz w:val="18"/>
@@ -8030,6 +8201,7 @@
                 <w:sz w:val="32"/>
                 <w:szCs w:val="32"/>
               </w:rPr>
+              <w:lastRenderedPageBreak/>
               <w:t>2번 문제 답안</w:t>
             </w:r>
           </w:p>
@@ -8051,170 +8223,2396 @@
               <w:rPr>
                 <w:rFonts w:ascii="맑은 고딕" w:eastAsia="맑은 고딕"/>
                 <w:b/>
-                <w:sz w:val="18"/>
-              </w:rPr>
-            </w:pPr>
-          </w:p>
-          <w:p>
-            <w:pPr>
-              <w:pStyle w:val="a3"/>
-              <w:spacing w:line="312" w:lineRule="auto"/>
-              <w:rPr>
-                <w:rFonts w:ascii="맑은 고딕" w:eastAsia="맑은 고딕"/>
-                <w:b/>
-                <w:sz w:val="18"/>
-              </w:rPr>
-            </w:pPr>
-          </w:p>
-          <w:p>
-            <w:pPr>
-              <w:pStyle w:val="a3"/>
-              <w:spacing w:line="312" w:lineRule="auto"/>
-              <w:rPr>
-                <w:rFonts w:ascii="맑은 고딕" w:eastAsia="맑은 고딕"/>
-                <w:b/>
-                <w:sz w:val="18"/>
-              </w:rPr>
-            </w:pPr>
-          </w:p>
-          <w:p>
-            <w:pPr>
-              <w:pStyle w:val="a3"/>
-              <w:spacing w:line="312" w:lineRule="auto"/>
-              <w:rPr>
-                <w:rFonts w:ascii="맑은 고딕" w:eastAsia="맑은 고딕"/>
-                <w:b/>
-                <w:sz w:val="18"/>
-              </w:rPr>
-            </w:pPr>
-          </w:p>
-          <w:p>
-            <w:pPr>
-              <w:pStyle w:val="a3"/>
-              <w:spacing w:line="312" w:lineRule="auto"/>
-              <w:rPr>
-                <w:rFonts w:ascii="맑은 고딕" w:eastAsia="맑은 고딕"/>
-                <w:b/>
-                <w:sz w:val="18"/>
-              </w:rPr>
-            </w:pPr>
-          </w:p>
-          <w:p>
-            <w:pPr>
-              <w:pStyle w:val="a3"/>
-              <w:spacing w:line="312" w:lineRule="auto"/>
-              <w:rPr>
-                <w:rFonts w:ascii="맑은 고딕" w:eastAsia="맑은 고딕"/>
-                <w:b/>
-                <w:sz w:val="18"/>
-              </w:rPr>
-            </w:pPr>
-          </w:p>
-          <w:p>
-            <w:pPr>
-              <w:pStyle w:val="a3"/>
-              <w:spacing w:line="312" w:lineRule="auto"/>
-              <w:rPr>
-                <w:rFonts w:ascii="맑은 고딕" w:eastAsia="맑은 고딕"/>
-                <w:b/>
-                <w:sz w:val="18"/>
-              </w:rPr>
-            </w:pPr>
-          </w:p>
-          <w:p>
-            <w:pPr>
-              <w:pStyle w:val="a3"/>
-              <w:spacing w:line="312" w:lineRule="auto"/>
-              <w:rPr>
-                <w:rFonts w:ascii="맑은 고딕" w:eastAsia="맑은 고딕"/>
-                <w:b/>
-                <w:sz w:val="18"/>
-              </w:rPr>
-            </w:pPr>
-          </w:p>
-          <w:p>
-            <w:pPr>
-              <w:pStyle w:val="a3"/>
-              <w:spacing w:line="312" w:lineRule="auto"/>
-              <w:rPr>
-                <w:rFonts w:ascii="맑은 고딕" w:eastAsia="맑은 고딕"/>
-                <w:b/>
-                <w:sz w:val="18"/>
-              </w:rPr>
-            </w:pPr>
-          </w:p>
-          <w:p>
-            <w:pPr>
-              <w:pStyle w:val="a3"/>
-              <w:spacing w:line="312" w:lineRule="auto"/>
-              <w:rPr>
-                <w:rFonts w:ascii="맑은 고딕" w:eastAsia="맑은 고딕"/>
-                <w:b/>
-                <w:sz w:val="18"/>
-              </w:rPr>
-            </w:pPr>
-          </w:p>
-          <w:p>
-            <w:pPr>
-              <w:pStyle w:val="a3"/>
-              <w:spacing w:line="312" w:lineRule="auto"/>
-              <w:rPr>
-                <w:rFonts w:ascii="맑은 고딕" w:eastAsia="맑은 고딕"/>
-                <w:b/>
-                <w:sz w:val="18"/>
-              </w:rPr>
-            </w:pPr>
-          </w:p>
-          <w:p>
-            <w:pPr>
-              <w:pStyle w:val="a3"/>
-              <w:spacing w:line="312" w:lineRule="auto"/>
-              <w:rPr>
-                <w:rFonts w:ascii="맑은 고딕" w:eastAsia="맑은 고딕"/>
-                <w:b/>
-                <w:sz w:val="18"/>
-              </w:rPr>
-            </w:pPr>
-          </w:p>
-          <w:p>
-            <w:pPr>
-              <w:pStyle w:val="a3"/>
-              <w:spacing w:line="312" w:lineRule="auto"/>
-              <w:rPr>
-                <w:rFonts w:ascii="맑은 고딕" w:eastAsia="맑은 고딕"/>
-                <w:b/>
-                <w:sz w:val="18"/>
-              </w:rPr>
-            </w:pPr>
-          </w:p>
-          <w:p>
-            <w:pPr>
-              <w:pStyle w:val="a3"/>
-              <w:spacing w:line="312" w:lineRule="auto"/>
-              <w:rPr>
-                <w:rFonts w:ascii="맑은 고딕" w:eastAsia="맑은 고딕"/>
-                <w:b/>
-                <w:sz w:val="18"/>
-              </w:rPr>
-            </w:pPr>
-          </w:p>
-          <w:p>
-            <w:pPr>
-              <w:pStyle w:val="a3"/>
-              <w:spacing w:line="312" w:lineRule="auto"/>
-              <w:rPr>
-                <w:rFonts w:ascii="맑은 고딕" w:eastAsia="맑은 고딕"/>
-                <w:b/>
-                <w:sz w:val="18"/>
-              </w:rPr>
-            </w:pPr>
-          </w:p>
-          <w:p>
-            <w:pPr>
-              <w:pStyle w:val="a3"/>
-              <w:spacing w:line="312" w:lineRule="auto"/>
-              <w:rPr>
-                <w:rFonts w:ascii="맑은 고딕" w:eastAsia="맑은 고딕"/>
+                <w:sz w:val="24"/>
+                <w:szCs w:val="24"/>
+              </w:rPr>
+            </w:pPr>
+            <w:r>
+              <w:rPr>
+                <w:rFonts w:ascii="맑은 고딕" w:eastAsia="맑은 고딕"/>
+                <w:b/>
+                <w:sz w:val="24"/>
+                <w:szCs w:val="24"/>
+              </w:rPr>
+              <w:t>1)</w:t>
+            </w:r>
+            <w:r>
+              <w:rPr>
+                <w:rFonts w:ascii="맑은 고딕" w:eastAsia="맑은 고딕"/>
+                <w:b/>
+                <w:sz w:val="24"/>
+                <w:szCs w:val="24"/>
+              </w:rPr>
+              <w:t xml:space="preserve"> </w:t>
+            </w:r>
+            <w:r>
+              <w:rPr>
+                <w:rFonts w:ascii="맑은 고딕" w:eastAsia="맑은 고딕" w:hint="eastAsia"/>
+                <w:b/>
+                <w:sz w:val="24"/>
+                <w:szCs w:val="24"/>
+              </w:rPr>
+              <w:t>주제 선택</w:t>
+            </w:r>
+            <w:r>
+              <w:rPr>
+                <w:rFonts w:ascii="맑은 고딕" w:eastAsia="맑은 고딕" w:hint="eastAsia"/>
+                <w:b/>
+                <w:sz w:val="24"/>
+                <w:szCs w:val="24"/>
+              </w:rPr>
+              <w:t>:</w:t>
+            </w:r>
+            <w:r>
+              <w:rPr>
+                <w:rFonts w:ascii="맑은 고딕" w:eastAsia="맑은 고딕"/>
+                <w:b/>
+                <w:sz w:val="24"/>
+                <w:szCs w:val="24"/>
+              </w:rPr>
+              <w:t xml:space="preserve"> </w:t>
+            </w:r>
+            <w:r>
+              <w:rPr>
+                <w:rFonts w:ascii="맑은 고딕" w:eastAsia="맑은 고딕" w:hint="eastAsia"/>
+                <w:b/>
+                <w:sz w:val="24"/>
+                <w:szCs w:val="24"/>
+              </w:rPr>
+              <w:t>최근 국내 여행의 트렌드</w:t>
+            </w:r>
+          </w:p>
+          <w:p>
+            <w:pPr>
+              <w:pStyle w:val="a3"/>
+              <w:spacing w:line="312" w:lineRule="auto"/>
+              <w:rPr>
+                <w:rFonts w:ascii="맑은 고딕" w:eastAsia="맑은 고딕"/>
+                <w:b/>
+                <w:sz w:val="18"/>
+                <w:szCs w:val="18"/>
+              </w:rPr>
+            </w:pPr>
+            <w:r>
+              <w:rPr>
+                <w:rFonts w:ascii="맑은 고딕" w:eastAsia="맑은 고딕" w:hint="eastAsia"/>
+                <w:b/>
+                <w:sz w:val="18"/>
+                <w:szCs w:val="18"/>
+              </w:rPr>
+              <w:t>최근 해외 여행보다 국내 여행의 비율이 더 높다는 기사를 본 적이 있다.</w:t>
+            </w:r>
+            <w:r>
+              <w:rPr>
+                <w:rFonts w:ascii="맑은 고딕" w:eastAsia="맑은 고딕"/>
+                <w:b/>
+                <w:sz w:val="18"/>
+                <w:szCs w:val="18"/>
+              </w:rPr>
+              <w:t xml:space="preserve"> </w:t>
+            </w:r>
+            <w:r>
+              <w:rPr>
+                <w:rFonts w:ascii="맑은 고딕" w:eastAsia="맑은 고딕" w:hint="eastAsia"/>
+                <w:b/>
+                <w:sz w:val="18"/>
+                <w:szCs w:val="18"/>
+              </w:rPr>
+              <w:t xml:space="preserve">마침 </w:t>
+            </w:r>
+            <w:proofErr w:type="spellStart"/>
+            <w:r>
+              <w:rPr>
+                <w:rFonts w:ascii="맑은 고딕" w:eastAsia="맑은 고딕" w:hint="eastAsia"/>
+                <w:b/>
+                <w:sz w:val="18"/>
+                <w:szCs w:val="18"/>
+              </w:rPr>
+              <w:t>공공데이터포털에</w:t>
+            </w:r>
+            <w:proofErr w:type="spellEnd"/>
+            <w:r>
+              <w:rPr>
+                <w:rFonts w:ascii="맑은 고딕" w:eastAsia="맑은 고딕" w:hint="eastAsia"/>
+                <w:b/>
+                <w:sz w:val="18"/>
+                <w:szCs w:val="18"/>
+              </w:rPr>
+              <w:t xml:space="preserve"> 한국문화관광연구원에서 제공하는 국민여행조사 통계 </w:t>
+            </w:r>
+            <w:proofErr w:type="spellStart"/>
+            <w:r>
+              <w:rPr>
+                <w:rFonts w:ascii="맑은 고딕" w:eastAsia="맑은 고딕" w:hint="eastAsia"/>
+                <w:b/>
+                <w:sz w:val="18"/>
+                <w:szCs w:val="18"/>
+              </w:rPr>
+              <w:t>원자료</w:t>
+            </w:r>
+            <w:proofErr w:type="spellEnd"/>
+            <w:r>
+              <w:rPr>
+                <w:rFonts w:ascii="맑은 고딕" w:eastAsia="맑은 고딕" w:hint="eastAsia"/>
+                <w:b/>
+                <w:sz w:val="18"/>
+                <w:szCs w:val="18"/>
+              </w:rPr>
+              <w:t xml:space="preserve"> 정보가 있어서 사람들이 여행을 어디로 주로 떠나는지,</w:t>
+            </w:r>
+            <w:r>
+              <w:rPr>
+                <w:rFonts w:ascii="맑은 고딕" w:eastAsia="맑은 고딕"/>
+                <w:b/>
+                <w:sz w:val="18"/>
+                <w:szCs w:val="18"/>
+              </w:rPr>
+              <w:t xml:space="preserve"> </w:t>
+            </w:r>
+            <w:r>
+              <w:rPr>
+                <w:rFonts w:ascii="맑은 고딕" w:eastAsia="맑은 고딕" w:hint="eastAsia"/>
+                <w:b/>
+                <w:sz w:val="18"/>
+                <w:szCs w:val="18"/>
+              </w:rPr>
+              <w:t xml:space="preserve">어떤 사람들이 어떤 목적으로 여행을 떠나서 어떤 활동을 하는지 등을 분석하기로 </w:t>
+            </w:r>
+            <w:proofErr w:type="spellStart"/>
+            <w:r>
+              <w:rPr>
+                <w:rFonts w:ascii="맑은 고딕" w:eastAsia="맑은 고딕" w:hint="eastAsia"/>
+                <w:b/>
+                <w:sz w:val="18"/>
+                <w:szCs w:val="18"/>
+              </w:rPr>
+              <w:t>헀다</w:t>
+            </w:r>
+            <w:proofErr w:type="spellEnd"/>
+            <w:r>
+              <w:rPr>
+                <w:rFonts w:ascii="맑은 고딕" w:eastAsia="맑은 고딕" w:hint="eastAsia"/>
+                <w:b/>
+                <w:sz w:val="18"/>
+                <w:szCs w:val="18"/>
+              </w:rPr>
+              <w:t>.</w:t>
+            </w:r>
+            <w:r>
+              <w:rPr>
+                <w:rFonts w:ascii="맑은 고딕" w:eastAsia="맑은 고딕"/>
+                <w:b/>
+                <w:sz w:val="18"/>
+                <w:szCs w:val="18"/>
+              </w:rPr>
+              <w:t xml:space="preserve"> </w:t>
+            </w:r>
+            <w:r>
+              <w:rPr>
+                <w:rFonts w:ascii="맑은 고딕" w:eastAsia="맑은 고딕" w:hint="eastAsia"/>
+                <w:b/>
+                <w:sz w:val="18"/>
+                <w:szCs w:val="18"/>
+              </w:rPr>
+              <w:t>목표를 몇 가지 다음과 같이 설정했다</w:t>
+            </w:r>
+            <w:r>
+              <w:rPr>
+                <w:rFonts w:ascii="맑은 고딕" w:eastAsia="맑은 고딕"/>
+                <w:b/>
+                <w:sz w:val="18"/>
+                <w:szCs w:val="18"/>
+              </w:rPr>
+              <w:t>:</w:t>
+            </w:r>
+          </w:p>
+          <w:p>
+            <w:pPr>
+              <w:pStyle w:val="a3"/>
+              <w:spacing w:line="312" w:lineRule="auto"/>
+              <w:rPr>
+                <w:rFonts w:ascii="맑은 고딕" w:eastAsia="맑은 고딕"/>
+                <w:b/>
+                <w:sz w:val="18"/>
+                <w:szCs w:val="18"/>
+              </w:rPr>
+            </w:pPr>
+          </w:p>
+          <w:p>
+            <w:pPr>
+              <w:pStyle w:val="a3"/>
+              <w:numPr>
+                <w:ilvl w:val="0"/>
+                <w:numId w:val="10"/>
+              </w:numPr>
+              <w:spacing w:line="312" w:lineRule="auto"/>
+              <w:rPr>
+                <w:rFonts w:ascii="맑은 고딕" w:eastAsia="맑은 고딕"/>
+                <w:b/>
+                <w:sz w:val="18"/>
+                <w:szCs w:val="18"/>
+              </w:rPr>
+            </w:pPr>
+            <w:r>
+              <w:rPr>
+                <w:rFonts w:ascii="맑은 고딕" w:eastAsia="맑은 고딕" w:hint="eastAsia"/>
+                <w:b/>
+                <w:sz w:val="18"/>
+                <w:szCs w:val="18"/>
+              </w:rPr>
+              <w:t>나이대에 따른 인기 여행지는 어떻게 되는가?</w:t>
+            </w:r>
+          </w:p>
+          <w:p>
+            <w:pPr>
+              <w:pStyle w:val="a3"/>
+              <w:numPr>
+                <w:ilvl w:val="0"/>
+                <w:numId w:val="10"/>
+              </w:numPr>
+              <w:spacing w:line="312" w:lineRule="auto"/>
+              <w:rPr>
+                <w:rFonts w:ascii="맑은 고딕" w:eastAsia="맑은 고딕"/>
+                <w:b/>
+                <w:sz w:val="18"/>
+                <w:szCs w:val="18"/>
+              </w:rPr>
+            </w:pPr>
+            <w:r>
+              <w:rPr>
+                <w:rFonts w:ascii="맑은 고딕" w:eastAsia="맑은 고딕" w:hint="eastAsia"/>
+                <w:b/>
+                <w:sz w:val="18"/>
+                <w:szCs w:val="18"/>
+              </w:rPr>
+              <w:t>시기</w:t>
+            </w:r>
+            <w:r>
+              <w:rPr>
+                <w:rFonts w:ascii="맑은 고딕" w:eastAsia="맑은 고딕" w:hint="eastAsia"/>
+                <w:b/>
+                <w:sz w:val="18"/>
+                <w:szCs w:val="18"/>
+              </w:rPr>
+              <w:t>(월별)</w:t>
+            </w:r>
+            <w:r>
+              <w:rPr>
+                <w:rFonts w:ascii="맑은 고딕" w:eastAsia="맑은 고딕" w:hint="eastAsia"/>
+                <w:b/>
+                <w:sz w:val="18"/>
+                <w:szCs w:val="18"/>
+              </w:rPr>
+              <w:t>에 따른 인기 여행지는 어떻게 되는가</w:t>
+            </w:r>
+            <w:r>
+              <w:rPr>
+                <w:rFonts w:ascii="맑은 고딕" w:eastAsia="맑은 고딕"/>
+                <w:b/>
+                <w:sz w:val="18"/>
+                <w:szCs w:val="18"/>
+              </w:rPr>
+              <w:t>?</w:t>
+            </w:r>
+          </w:p>
+          <w:p>
+            <w:pPr>
+              <w:pStyle w:val="a3"/>
+              <w:numPr>
+                <w:ilvl w:val="0"/>
+                <w:numId w:val="10"/>
+              </w:numPr>
+              <w:spacing w:line="312" w:lineRule="auto"/>
+              <w:rPr>
+                <w:rFonts w:ascii="맑은 고딕" w:eastAsia="맑은 고딕"/>
+                <w:b/>
+                <w:sz w:val="18"/>
+                <w:szCs w:val="18"/>
+              </w:rPr>
+            </w:pPr>
+            <w:r>
+              <w:rPr>
+                <w:rFonts w:ascii="맑은 고딕" w:eastAsia="맑은 고딕" w:hint="eastAsia"/>
+                <w:b/>
+                <w:sz w:val="18"/>
+                <w:szCs w:val="18"/>
+              </w:rPr>
+              <w:t xml:space="preserve">혼인 여부에 따른 인기 여행지는 어떻게 </w:t>
+            </w:r>
+            <w:proofErr w:type="spellStart"/>
+            <w:r>
+              <w:rPr>
+                <w:rFonts w:ascii="맑은 고딕" w:eastAsia="맑은 고딕" w:hint="eastAsia"/>
+                <w:b/>
+                <w:sz w:val="18"/>
+                <w:szCs w:val="18"/>
+              </w:rPr>
+              <w:t>다른가</w:t>
+            </w:r>
+            <w:proofErr w:type="spellEnd"/>
+            <w:r>
+              <w:rPr>
+                <w:rFonts w:ascii="맑은 고딕" w:eastAsia="맑은 고딕"/>
+                <w:b/>
+                <w:sz w:val="18"/>
+                <w:szCs w:val="18"/>
+              </w:rPr>
+              <w:t>?</w:t>
+            </w:r>
+          </w:p>
+          <w:p>
+            <w:pPr>
+              <w:pStyle w:val="a3"/>
+              <w:spacing w:line="312" w:lineRule="auto"/>
+              <w:rPr>
+                <w:rFonts w:ascii="맑은 고딕" w:eastAsia="맑은 고딕"/>
+                <w:b/>
+                <w:sz w:val="18"/>
+                <w:szCs w:val="18"/>
+              </w:rPr>
+            </w:pPr>
+          </w:p>
+          <w:p>
+            <w:pPr>
+              <w:pStyle w:val="a3"/>
+              <w:spacing w:line="312" w:lineRule="auto"/>
+              <w:rPr>
+                <w:rFonts w:ascii="맑은 고딕" w:eastAsia="맑은 고딕"/>
+                <w:b/>
+                <w:sz w:val="24"/>
+                <w:szCs w:val="24"/>
+              </w:rPr>
+            </w:pPr>
+            <w:r>
+              <w:rPr>
+                <w:rFonts w:ascii="맑은 고딕" w:eastAsia="맑은 고딕"/>
+                <w:b/>
+                <w:sz w:val="24"/>
+                <w:szCs w:val="24"/>
+              </w:rPr>
+              <w:t xml:space="preserve">2) </w:t>
+            </w:r>
+            <w:r>
+              <w:rPr>
+                <w:rFonts w:ascii="맑은 고딕" w:eastAsia="맑은 고딕" w:hint="eastAsia"/>
+                <w:b/>
+                <w:sz w:val="24"/>
+                <w:szCs w:val="24"/>
+              </w:rPr>
+              <w:t>데이터셋</w:t>
+            </w:r>
+          </w:p>
+          <w:p>
+            <w:pPr>
+              <w:pStyle w:val="a3"/>
+              <w:spacing w:line="312" w:lineRule="auto"/>
+              <w:rPr>
+                <w:rFonts w:ascii="맑은 고딕" w:eastAsia="맑은 고딕"/>
+                <w:b/>
+                <w:sz w:val="18"/>
+                <w:szCs w:val="18"/>
+              </w:rPr>
+            </w:pPr>
+            <w:proofErr w:type="spellStart"/>
+            <w:r>
+              <w:rPr>
+                <w:rFonts w:ascii="맑은 고딕" w:eastAsia="맑은 고딕" w:hint="eastAsia"/>
+                <w:b/>
+                <w:sz w:val="18"/>
+                <w:szCs w:val="18"/>
+              </w:rPr>
+              <w:t>공공데이터포털의</w:t>
+            </w:r>
+            <w:proofErr w:type="spellEnd"/>
+            <w:r>
+              <w:rPr>
+                <w:rFonts w:ascii="맑은 고딕" w:eastAsia="맑은 고딕" w:hint="eastAsia"/>
+                <w:b/>
+                <w:sz w:val="18"/>
+                <w:szCs w:val="18"/>
+              </w:rPr>
+              <w:t xml:space="preserve"> 한국문화관광연구원_국민여행조사 통계 </w:t>
+            </w:r>
+            <w:proofErr w:type="spellStart"/>
+            <w:r>
+              <w:rPr>
+                <w:rFonts w:ascii="맑은 고딕" w:eastAsia="맑은 고딕" w:hint="eastAsia"/>
+                <w:b/>
+                <w:sz w:val="18"/>
+                <w:szCs w:val="18"/>
+              </w:rPr>
+              <w:t>원자료</w:t>
+            </w:r>
+            <w:proofErr w:type="spellEnd"/>
+            <w:r>
+              <w:rPr>
+                <w:rFonts w:ascii="맑은 고딕" w:eastAsia="맑은 고딕" w:hint="eastAsia"/>
+                <w:b/>
+                <w:sz w:val="18"/>
+                <w:szCs w:val="18"/>
+              </w:rPr>
+              <w:t xml:space="preserve"> 정보 데이터를 사용했다.</w:t>
+            </w:r>
+          </w:p>
+          <w:p>
+            <w:pPr>
+              <w:pStyle w:val="a3"/>
+              <w:spacing w:line="312" w:lineRule="auto"/>
+              <w:rPr>
+                <w:rFonts w:ascii="맑은 고딕" w:eastAsia="맑은 고딕" w:hint="eastAsia"/>
+                <w:b/>
+                <w:sz w:val="18"/>
+                <w:szCs w:val="18"/>
+              </w:rPr>
+            </w:pPr>
+            <w:r>
+              <w:rPr>
+                <w:rFonts w:ascii="맑은 고딕" w:eastAsia="맑은 고딕"/>
+                <w:b/>
+                <w:noProof/>
+                <w:sz w:val="18"/>
+                <w:szCs w:val="18"/>
+              </w:rPr>
+              <w:drawing>
+                <wp:inline distT="0" distB="0" distL="0" distR="0" wp14:anchorId="485DBBE0" wp14:editId="23C78D22">
+                  <wp:extent cx="3135011" cy="1192696"/>
+                  <wp:effectExtent l="0" t="0" r="8255" b="7620"/>
+                  <wp:docPr id="9" name="그림 9"/>
+                  <wp:cNvGraphicFramePr>
+                    <a:graphicFrameLocks xmlns:a="http://schemas.openxmlformats.org/drawingml/2006/main" noChangeAspect="1"/>
+                  </wp:cNvGraphicFramePr>
+                  <a:graphic xmlns:a="http://schemas.openxmlformats.org/drawingml/2006/main">
+                    <a:graphicData uri="http://schemas.openxmlformats.org/drawingml/2006/picture">
+                      <pic:pic xmlns:pic="http://schemas.openxmlformats.org/drawingml/2006/picture">
+                        <pic:nvPicPr>
+                          <pic:cNvPr id="0" name="Picture 9"/>
+                          <pic:cNvPicPr>
+                            <a:picLocks noChangeAspect="1" noChangeArrowheads="1"/>
+                          </pic:cNvPicPr>
+                        </pic:nvPicPr>
+                        <pic:blipFill>
+                          <a:blip r:embed="rId16">
+                            <a:extLst>
+                              <a:ext uri="{28A0092B-C50C-407E-A947-70E740481C1C}">
+                                <a14:useLocalDpi xmlns:a14="http://schemas.microsoft.com/office/drawing/2010/main" val="0"/>
+                              </a:ext>
+                            </a:extLst>
+                          </a:blip>
+                          <a:srcRect/>
+                          <a:stretch>
+                            <a:fillRect/>
+                          </a:stretch>
+                        </pic:blipFill>
+                        <pic:spPr bwMode="auto">
+                          <a:xfrm>
+                            <a:off x="0" y="0"/>
+                            <a:ext cx="3175057" cy="1207931"/>
+                          </a:xfrm>
+                          <a:prstGeom prst="rect">
+                            <a:avLst/>
+                          </a:prstGeom>
+                          <a:noFill/>
+                          <a:ln>
+                            <a:noFill/>
+                          </a:ln>
+                        </pic:spPr>
+                      </pic:pic>
+                    </a:graphicData>
+                  </a:graphic>
+                </wp:inline>
+              </w:drawing>
+            </w:r>
+          </w:p>
+          <w:p>
+            <w:pPr>
+              <w:pStyle w:val="a3"/>
+              <w:spacing w:line="312" w:lineRule="auto"/>
+              <w:rPr>
+                <w:rFonts w:ascii="맑은 고딕" w:eastAsia="맑은 고딕"/>
+                <w:b/>
+                <w:sz w:val="18"/>
+              </w:rPr>
+            </w:pPr>
+          </w:p>
+          <w:p>
+            <w:pPr>
+              <w:pStyle w:val="a3"/>
+              <w:spacing w:line="312" w:lineRule="auto"/>
+              <w:rPr>
+                <w:rFonts w:ascii="맑은 고딕" w:eastAsia="맑은 고딕"/>
+                <w:b/>
+                <w:sz w:val="24"/>
+                <w:szCs w:val="24"/>
+              </w:rPr>
+            </w:pPr>
+            <w:r>
+              <w:rPr>
+                <w:rFonts w:ascii="맑은 고딕" w:eastAsia="맑은 고딕" w:hint="eastAsia"/>
+                <w:b/>
+                <w:sz w:val="24"/>
+                <w:szCs w:val="24"/>
+              </w:rPr>
+              <w:t>3</w:t>
+            </w:r>
+            <w:r>
+              <w:rPr>
+                <w:rFonts w:ascii="맑은 고딕" w:eastAsia="맑은 고딕"/>
+                <w:b/>
+                <w:sz w:val="24"/>
+                <w:szCs w:val="24"/>
+              </w:rPr>
+              <w:t xml:space="preserve">) </w:t>
+            </w:r>
+            <w:r>
+              <w:rPr>
+                <w:rFonts w:ascii="맑은 고딕" w:eastAsia="맑은 고딕" w:hint="eastAsia"/>
+                <w:b/>
+                <w:sz w:val="24"/>
+                <w:szCs w:val="24"/>
+              </w:rPr>
+              <w:t xml:space="preserve">전체 </w:t>
+            </w:r>
+            <w:r>
+              <w:rPr>
+                <w:rFonts w:ascii="맑은 고딕" w:eastAsia="맑은 고딕" w:hint="eastAsia"/>
+                <w:b/>
+                <w:sz w:val="24"/>
+                <w:szCs w:val="24"/>
+              </w:rPr>
+              <w:t xml:space="preserve">데이터 </w:t>
+            </w:r>
+            <w:proofErr w:type="spellStart"/>
+            <w:r>
+              <w:rPr>
+                <w:rFonts w:ascii="맑은 고딕" w:eastAsia="맑은 고딕" w:hint="eastAsia"/>
+                <w:b/>
+                <w:sz w:val="24"/>
+                <w:szCs w:val="24"/>
+              </w:rPr>
+              <w:t>전처리</w:t>
+            </w:r>
+            <w:proofErr w:type="spellEnd"/>
+          </w:p>
+          <w:p>
+            <w:pPr>
+              <w:pStyle w:val="a3"/>
+              <w:spacing w:line="312" w:lineRule="auto"/>
+              <w:rPr>
+                <w:rFonts w:ascii="맑은 고딕" w:eastAsia="맑은 고딕" w:hint="eastAsia"/>
+                <w:b/>
+                <w:sz w:val="18"/>
+              </w:rPr>
+            </w:pPr>
+            <w:r>
+              <w:rPr>
+                <w:rFonts w:ascii="맑은 고딕" w:eastAsia="맑은 고딕" w:hint="eastAsia"/>
+                <w:b/>
+                <w:sz w:val="18"/>
+              </w:rPr>
+              <w:t xml:space="preserve">데이터 크기가 너무 커서 메모리에 </w:t>
+            </w:r>
+            <w:proofErr w:type="spellStart"/>
+            <w:r>
+              <w:rPr>
+                <w:rFonts w:ascii="맑은 고딕" w:eastAsia="맑은 고딕" w:hint="eastAsia"/>
+                <w:b/>
+                <w:sz w:val="18"/>
+              </w:rPr>
+              <w:t>로드하는</w:t>
+            </w:r>
+            <w:proofErr w:type="spellEnd"/>
+            <w:r>
+              <w:rPr>
+                <w:rFonts w:ascii="맑은 고딕" w:eastAsia="맑은 고딕" w:hint="eastAsia"/>
+                <w:b/>
+                <w:sz w:val="18"/>
+              </w:rPr>
+              <w:t xml:space="preserve"> 데에만 </w:t>
+            </w:r>
+            <w:r>
+              <w:rPr>
+                <w:rFonts w:ascii="맑은 고딕" w:eastAsia="맑은 고딕"/>
+                <w:b/>
+                <w:sz w:val="18"/>
+              </w:rPr>
+              <w:t>20</w:t>
+            </w:r>
+            <w:r>
+              <w:rPr>
+                <w:rFonts w:ascii="맑은 고딕" w:eastAsia="맑은 고딕" w:hint="eastAsia"/>
+                <w:b/>
+                <w:sz w:val="18"/>
+              </w:rPr>
+              <w:t>분 정도 걸렸다.</w:t>
+            </w:r>
+            <w:r>
+              <w:rPr>
+                <w:rFonts w:ascii="맑은 고딕" w:eastAsia="맑은 고딕"/>
+                <w:b/>
+                <w:sz w:val="18"/>
+              </w:rPr>
+              <w:t xml:space="preserve"> </w:t>
+            </w:r>
+            <w:r>
+              <w:rPr>
+                <w:rFonts w:ascii="맑은 고딕" w:eastAsia="맑은 고딕" w:hint="eastAsia"/>
+                <w:b/>
+                <w:sz w:val="18"/>
+              </w:rPr>
+              <w:t>코드 실행할 때마다 그럴 수는 없기 때문에 내가 필요한 데이터만 추출,</w:t>
+            </w:r>
+            <w:r>
+              <w:rPr>
+                <w:rFonts w:ascii="맑은 고딕" w:eastAsia="맑은 고딕"/>
+                <w:b/>
+                <w:sz w:val="18"/>
+              </w:rPr>
+              <w:t xml:space="preserve"> </w:t>
+            </w:r>
+            <w:r>
+              <w:rPr>
+                <w:rFonts w:ascii="맑은 고딕" w:eastAsia="맑은 고딕" w:hint="eastAsia"/>
+                <w:b/>
+                <w:sz w:val="18"/>
+              </w:rPr>
+              <w:t xml:space="preserve">가공하고 최소한의 </w:t>
+            </w:r>
+            <w:proofErr w:type="spellStart"/>
+            <w:r>
+              <w:rPr>
+                <w:rFonts w:ascii="맑은 고딕" w:eastAsia="맑은 고딕" w:hint="eastAsia"/>
+                <w:b/>
+                <w:sz w:val="18"/>
+              </w:rPr>
+              <w:t>결측치만</w:t>
+            </w:r>
+            <w:proofErr w:type="spellEnd"/>
+            <w:r>
+              <w:rPr>
+                <w:rFonts w:ascii="맑은 고딕" w:eastAsia="맑은 고딕" w:hint="eastAsia"/>
+                <w:b/>
+                <w:sz w:val="18"/>
+              </w:rPr>
+              <w:t xml:space="preserve"> 제거해서 재구성,</w:t>
+            </w:r>
+            <w:r>
+              <w:rPr>
+                <w:rFonts w:ascii="맑은 고딕" w:eastAsia="맑은 고딕"/>
+                <w:b/>
+                <w:sz w:val="18"/>
+              </w:rPr>
+              <w:t xml:space="preserve"> </w:t>
+            </w:r>
+            <w:r>
+              <w:rPr>
+                <w:rFonts w:ascii="맑은 고딕" w:eastAsia="맑은 고딕" w:hint="eastAsia"/>
+                <w:b/>
+                <w:sz w:val="18"/>
+              </w:rPr>
+              <w:t>엑셀로 다시 저장했다.</w:t>
+            </w:r>
+            <w:r>
+              <w:rPr>
+                <w:rFonts w:ascii="맑은 고딕" w:eastAsia="맑은 고딕"/>
+                <w:b/>
+                <w:sz w:val="18"/>
+              </w:rPr>
+              <w:t xml:space="preserve"> </w:t>
+            </w:r>
+            <w:r>
+              <w:rPr>
+                <w:rFonts w:ascii="맑은 고딕" w:eastAsia="맑은 고딕" w:hint="eastAsia"/>
+                <w:b/>
+                <w:sz w:val="18"/>
+              </w:rPr>
+              <w:t>그 결과로 생성한 데이터 프레임이 다음과 같다</w:t>
+            </w:r>
+            <w:r>
+              <w:rPr>
+                <w:rFonts w:ascii="맑은 고딕" w:eastAsia="맑은 고딕"/>
+                <w:b/>
+                <w:sz w:val="18"/>
+              </w:rPr>
+              <w:t>.</w:t>
+            </w:r>
+          </w:p>
+          <w:p>
+            <w:pPr>
+              <w:pStyle w:val="a3"/>
+              <w:spacing w:line="312" w:lineRule="auto"/>
+              <w:rPr>
+                <w:rFonts w:ascii="맑은 고딕" w:eastAsia="맑은 고딕" w:hint="eastAsia"/>
+                <w:b/>
+                <w:sz w:val="18"/>
+              </w:rPr>
+            </w:pPr>
+            <w:r>
+              <w:rPr>
+                <w:rFonts w:ascii="맑은 고딕" w:eastAsia="맑은 고딕"/>
+                <w:b/>
+                <w:sz w:val="18"/>
+              </w:rPr>
+              <w:lastRenderedPageBreak/>
+              <w:t xml:space="preserve"> </w:t>
+            </w:r>
+            <w:r>
+              <w:rPr>
+                <w:rFonts w:ascii="맑은 고딕" w:eastAsia="맑은 고딕"/>
+                <w:b/>
+                <w:noProof/>
+                <w:sz w:val="18"/>
+              </w:rPr>
+              <w:drawing>
+                <wp:inline distT="0" distB="0" distL="0" distR="0" wp14:anchorId="15A2B60D" wp14:editId="028CD83E">
+                  <wp:extent cx="2496709" cy="3181785"/>
+                  <wp:effectExtent l="0" t="0" r="0" b="0"/>
+                  <wp:docPr id="10" name="그림 10"/>
+                  <wp:cNvGraphicFramePr>
+                    <a:graphicFrameLocks xmlns:a="http://schemas.openxmlformats.org/drawingml/2006/main" noChangeAspect="1"/>
+                  </wp:cNvGraphicFramePr>
+                  <a:graphic xmlns:a="http://schemas.openxmlformats.org/drawingml/2006/main">
+                    <a:graphicData uri="http://schemas.openxmlformats.org/drawingml/2006/picture">
+                      <pic:pic xmlns:pic="http://schemas.openxmlformats.org/drawingml/2006/picture">
+                        <pic:nvPicPr>
+                          <pic:cNvPr id="0" name="Picture 10"/>
+                          <pic:cNvPicPr>
+                            <a:picLocks noChangeAspect="1" noChangeArrowheads="1"/>
+                          </pic:cNvPicPr>
+                        </pic:nvPicPr>
+                        <pic:blipFill>
+                          <a:blip r:embed="rId17">
+                            <a:extLst>
+                              <a:ext uri="{28A0092B-C50C-407E-A947-70E740481C1C}">
+                                <a14:useLocalDpi xmlns:a14="http://schemas.microsoft.com/office/drawing/2010/main" val="0"/>
+                              </a:ext>
+                            </a:extLst>
+                          </a:blip>
+                          <a:srcRect/>
+                          <a:stretch>
+                            <a:fillRect/>
+                          </a:stretch>
+                        </pic:blipFill>
+                        <pic:spPr bwMode="auto">
+                          <a:xfrm>
+                            <a:off x="0" y="0"/>
+                            <a:ext cx="2523863" cy="3216389"/>
+                          </a:xfrm>
+                          <a:prstGeom prst="rect">
+                            <a:avLst/>
+                          </a:prstGeom>
+                          <a:noFill/>
+                          <a:ln>
+                            <a:noFill/>
+                          </a:ln>
+                        </pic:spPr>
+                      </pic:pic>
+                    </a:graphicData>
+                  </a:graphic>
+                </wp:inline>
+              </w:drawing>
+            </w:r>
+          </w:p>
+          <w:p>
+            <w:pPr>
+              <w:pStyle w:val="a3"/>
+              <w:spacing w:line="312" w:lineRule="auto"/>
+              <w:rPr>
+                <w:rFonts w:ascii="맑은 고딕" w:eastAsia="맑은 고딕" w:hint="eastAsia"/>
+                <w:b/>
+                <w:sz w:val="18"/>
+              </w:rPr>
+            </w:pPr>
+            <w:proofErr w:type="spellStart"/>
+            <w:r>
+              <w:rPr>
+                <w:rFonts w:ascii="맑은 고딕" w:eastAsia="맑은 고딕" w:hint="eastAsia"/>
+                <w:b/>
+                <w:sz w:val="18"/>
+              </w:rPr>
+              <w:t>방문지</w:t>
+            </w:r>
+            <w:proofErr w:type="spellEnd"/>
+            <w:r>
+              <w:rPr>
+                <w:rFonts w:ascii="맑은 고딕" w:eastAsia="맑은 고딕" w:hint="eastAsia"/>
+                <w:b/>
+                <w:sz w:val="18"/>
+              </w:rPr>
+              <w:t xml:space="preserve"> 문항이 모두 </w:t>
+            </w:r>
+            <w:proofErr w:type="spellStart"/>
+            <w:r>
+              <w:rPr>
+                <w:rFonts w:ascii="맑은 고딕" w:eastAsia="맑은 고딕" w:hint="eastAsia"/>
+                <w:b/>
+                <w:sz w:val="18"/>
+              </w:rPr>
+              <w:t>결측인</w:t>
+            </w:r>
+            <w:proofErr w:type="spellEnd"/>
+            <w:r>
+              <w:rPr>
+                <w:rFonts w:ascii="맑은 고딕" w:eastAsia="맑은 고딕" w:hint="eastAsia"/>
+                <w:b/>
+                <w:sz w:val="18"/>
+              </w:rPr>
+              <w:t xml:space="preserve"> 행을 삭제하고 다른 기타 </w:t>
+            </w:r>
+            <w:proofErr w:type="spellStart"/>
+            <w:r>
+              <w:rPr>
+                <w:rFonts w:ascii="맑은 고딕" w:eastAsia="맑은 고딕" w:hint="eastAsia"/>
+                <w:b/>
+                <w:sz w:val="18"/>
+              </w:rPr>
+              <w:t>결측값에</w:t>
+            </w:r>
+            <w:proofErr w:type="spellEnd"/>
+            <w:r>
+              <w:rPr>
+                <w:rFonts w:ascii="맑은 고딕" w:eastAsia="맑은 고딕" w:hint="eastAsia"/>
+                <w:b/>
+                <w:sz w:val="18"/>
+              </w:rPr>
+              <w:t xml:space="preserve"> 대해서는 </w:t>
+            </w:r>
+            <w:proofErr w:type="spellStart"/>
+            <w:r>
+              <w:rPr>
+                <w:rFonts w:ascii="맑은 고딕" w:eastAsia="맑은 고딕" w:hint="eastAsia"/>
+                <w:b/>
+                <w:sz w:val="18"/>
+              </w:rPr>
+              <w:t>기존값을</w:t>
+            </w:r>
+            <w:proofErr w:type="spellEnd"/>
+            <w:r>
+              <w:rPr>
+                <w:rFonts w:ascii="맑은 고딕" w:eastAsia="맑은 고딕" w:hint="eastAsia"/>
+                <w:b/>
+                <w:sz w:val="18"/>
+              </w:rPr>
+              <w:t xml:space="preserve"> 유지하거나 기본값으로 대체하였다.</w:t>
+            </w:r>
+            <w:r>
+              <w:rPr>
+                <w:rFonts w:ascii="맑은 고딕" w:eastAsia="맑은 고딕"/>
+                <w:b/>
+                <w:sz w:val="18"/>
+              </w:rPr>
+              <w:t xml:space="preserve"> </w:t>
+            </w:r>
+            <w:r>
+              <w:rPr>
+                <w:rFonts w:ascii="맑은 고딕" w:eastAsia="맑은 고딕" w:hint="eastAsia"/>
+                <w:b/>
+                <w:sz w:val="18"/>
+              </w:rPr>
+              <w:t xml:space="preserve">그 결과로 대충 </w:t>
+            </w:r>
+            <w:r>
+              <w:rPr>
+                <w:rFonts w:ascii="맑은 고딕" w:eastAsia="맑은 고딕"/>
+                <w:b/>
+                <w:sz w:val="18"/>
+              </w:rPr>
+              <w:t>5</w:t>
+            </w:r>
+            <w:r>
+              <w:rPr>
+                <w:rFonts w:ascii="맑은 고딕" w:eastAsia="맑은 고딕" w:hint="eastAsia"/>
+                <w:b/>
+                <w:sz w:val="18"/>
+              </w:rPr>
+              <w:t xml:space="preserve">만 </w:t>
+            </w:r>
+            <w:r>
+              <w:rPr>
+                <w:rFonts w:ascii="맑은 고딕" w:eastAsia="맑은 고딕"/>
+                <w:b/>
+                <w:sz w:val="18"/>
+              </w:rPr>
+              <w:t>1</w:t>
+            </w:r>
+            <w:r>
+              <w:rPr>
+                <w:rFonts w:ascii="맑은 고딕" w:eastAsia="맑은 고딕" w:hint="eastAsia"/>
+                <w:b/>
+                <w:sz w:val="18"/>
+              </w:rPr>
+              <w:t xml:space="preserve">천개의 행에서 </w:t>
+            </w:r>
+            <w:r>
+              <w:rPr>
+                <w:rFonts w:ascii="맑은 고딕" w:eastAsia="맑은 고딕"/>
+                <w:b/>
+                <w:sz w:val="18"/>
+              </w:rPr>
+              <w:t>3000</w:t>
+            </w:r>
+            <w:r>
+              <w:rPr>
+                <w:rFonts w:ascii="맑은 고딕" w:eastAsia="맑은 고딕" w:hint="eastAsia"/>
+                <w:b/>
+                <w:sz w:val="18"/>
+              </w:rPr>
+              <w:t>개의 행이 삭제됐다.</w:t>
+            </w:r>
+            <w:r>
+              <w:rPr>
+                <w:rFonts w:ascii="맑은 고딕" w:eastAsia="맑은 고딕"/>
+                <w:b/>
+                <w:sz w:val="18"/>
+              </w:rPr>
+              <w:t xml:space="preserve"> </w:t>
+            </w:r>
+            <w:proofErr w:type="spellStart"/>
+            <w:r>
+              <w:rPr>
+                <w:rFonts w:ascii="맑은 고딕" w:eastAsia="맑은 고딕" w:hint="eastAsia"/>
+                <w:b/>
+                <w:sz w:val="18"/>
+              </w:rPr>
+              <w:t>방문지</w:t>
+            </w:r>
+            <w:proofErr w:type="spellEnd"/>
+            <w:r>
+              <w:rPr>
+                <w:rFonts w:ascii="맑은 고딕" w:eastAsia="맑은 고딕" w:hint="eastAsia"/>
+                <w:b/>
+                <w:sz w:val="18"/>
+              </w:rPr>
+              <w:t xml:space="preserve"> 문항은 원본 데이터셋에서 다음 패턴에 완전히 매칭되는 열이다.</w:t>
+            </w:r>
+          </w:p>
+          <w:p>
+            <w:pPr>
+              <w:pStyle w:val="a3"/>
+              <w:spacing w:line="312" w:lineRule="auto"/>
+              <w:rPr>
+                <w:rFonts w:ascii="맑은 고딕" w:eastAsia="맑은 고딕"/>
+                <w:b/>
+                <w:sz w:val="18"/>
+              </w:rPr>
+            </w:pPr>
+            <w:r>
+              <w:rPr>
+                <w:rFonts w:ascii="맑은 고딕" w:eastAsia="맑은 고딕"/>
+                <w:b/>
+                <w:noProof/>
+                <w:sz w:val="18"/>
+              </w:rPr>
+              <w:drawing>
+                <wp:inline distT="0" distB="0" distL="0" distR="0" wp14:anchorId="0C7A6D34" wp14:editId="4FBC12DF">
+                  <wp:extent cx="4683125" cy="230505"/>
+                  <wp:effectExtent l="0" t="0" r="3175" b="0"/>
+                  <wp:docPr id="11" name="그림 11"/>
+                  <wp:cNvGraphicFramePr>
+                    <a:graphicFrameLocks xmlns:a="http://schemas.openxmlformats.org/drawingml/2006/main" noChangeAspect="1"/>
+                  </wp:cNvGraphicFramePr>
+                  <a:graphic xmlns:a="http://schemas.openxmlformats.org/drawingml/2006/main">
+                    <a:graphicData uri="http://schemas.openxmlformats.org/drawingml/2006/picture">
+                      <pic:pic xmlns:pic="http://schemas.openxmlformats.org/drawingml/2006/picture">
+                        <pic:nvPicPr>
+                          <pic:cNvPr id="0" name="Picture 11"/>
+                          <pic:cNvPicPr>
+                            <a:picLocks noChangeAspect="1" noChangeArrowheads="1"/>
+                          </pic:cNvPicPr>
+                        </pic:nvPicPr>
+                        <pic:blipFill>
+                          <a:blip r:embed="rId18">
+                            <a:extLst>
+                              <a:ext uri="{28A0092B-C50C-407E-A947-70E740481C1C}">
+                                <a14:useLocalDpi xmlns:a14="http://schemas.microsoft.com/office/drawing/2010/main" val="0"/>
+                              </a:ext>
+                            </a:extLst>
+                          </a:blip>
+                          <a:srcRect/>
+                          <a:stretch>
+                            <a:fillRect/>
+                          </a:stretch>
+                        </pic:blipFill>
+                        <pic:spPr bwMode="auto">
+                          <a:xfrm>
+                            <a:off x="0" y="0"/>
+                            <a:ext cx="4683125" cy="230505"/>
+                          </a:xfrm>
+                          <a:prstGeom prst="rect">
+                            <a:avLst/>
+                          </a:prstGeom>
+                          <a:noFill/>
+                          <a:ln>
+                            <a:noFill/>
+                          </a:ln>
+                        </pic:spPr>
+                      </pic:pic>
+                    </a:graphicData>
+                  </a:graphic>
+                </wp:inline>
+              </w:drawing>
+            </w:r>
+          </w:p>
+          <w:p>
+            <w:pPr>
+              <w:pStyle w:val="a3"/>
+              <w:spacing w:line="312" w:lineRule="auto"/>
+              <w:rPr>
+                <w:rFonts w:ascii="맑은 고딕" w:eastAsia="맑은 고딕"/>
+                <w:b/>
+                <w:sz w:val="18"/>
+              </w:rPr>
+            </w:pPr>
+            <w:r>
+              <w:rPr>
+                <w:rFonts w:ascii="맑은 고딕" w:eastAsia="맑은 고딕" w:hint="eastAsia"/>
+                <w:b/>
+                <w:sz w:val="18"/>
+              </w:rPr>
+              <w:t>또 기존 열 이름이</w:t>
+            </w:r>
+            <w:r>
+              <w:rPr>
+                <w:rFonts w:ascii="맑은 고딕" w:eastAsia="맑은 고딕"/>
+                <w:b/>
+                <w:sz w:val="18"/>
+              </w:rPr>
+              <w:t xml:space="preserve"> </w:t>
+            </w:r>
+            <w:r>
+              <w:rPr>
+                <w:rFonts w:ascii="맑은 고딕" w:eastAsia="맑은 고딕" w:hint="eastAsia"/>
+                <w:b/>
+                <w:sz w:val="18"/>
+              </w:rPr>
+              <w:t>변수명으로 지정되어 있고</w:t>
+            </w:r>
+            <w:r>
+              <w:rPr>
+                <w:rFonts w:ascii="맑은 고딕" w:eastAsia="맑은 고딕"/>
+                <w:b/>
+                <w:sz w:val="18"/>
+              </w:rPr>
+              <w:t xml:space="preserve"> </w:t>
+            </w:r>
+            <w:r>
+              <w:rPr>
+                <w:rFonts w:ascii="맑은 고딕" w:eastAsia="맑은 고딕" w:hint="eastAsia"/>
+                <w:b/>
+                <w:sz w:val="18"/>
+              </w:rPr>
+              <w:t xml:space="preserve">데이터가 특정 코드로 기입되어 있는 경우가 있어서 데이터셋에서 제공하는 </w:t>
+            </w:r>
+            <w:proofErr w:type="spellStart"/>
+            <w:r>
+              <w:rPr>
+                <w:rFonts w:ascii="맑은 고딕" w:eastAsia="맑은 고딕" w:hint="eastAsia"/>
+                <w:b/>
+                <w:sz w:val="18"/>
+              </w:rPr>
+              <w:t>코드북을</w:t>
+            </w:r>
+            <w:proofErr w:type="spellEnd"/>
+            <w:r>
+              <w:rPr>
+                <w:rFonts w:ascii="맑은 고딕" w:eastAsia="맑은 고딕" w:hint="eastAsia"/>
+                <w:b/>
+                <w:sz w:val="18"/>
+              </w:rPr>
+              <w:t xml:space="preserve"> 참고하여 </w:t>
+            </w:r>
+            <w:proofErr w:type="spellStart"/>
+            <w:r>
+              <w:rPr>
+                <w:rFonts w:ascii="맑은 고딕" w:eastAsia="맑은 고딕" w:hint="eastAsia"/>
+                <w:b/>
+                <w:sz w:val="18"/>
+              </w:rPr>
+              <w:t>딕셔너리를</w:t>
+            </w:r>
+            <w:proofErr w:type="spellEnd"/>
+            <w:r>
+              <w:rPr>
+                <w:rFonts w:ascii="맑은 고딕" w:eastAsia="맑은 고딕" w:hint="eastAsia"/>
+                <w:b/>
+                <w:sz w:val="18"/>
+              </w:rPr>
+              <w:t xml:space="preserve"> 생성하고 이를 사용하여 변환했다.</w:t>
+            </w:r>
+          </w:p>
+          <w:p>
+            <w:pPr>
+              <w:pStyle w:val="a3"/>
+              <w:spacing w:line="312" w:lineRule="auto"/>
+              <w:rPr>
+                <w:rFonts w:ascii="맑은 고딕" w:eastAsia="맑은 고딕" w:hint="eastAsia"/>
+                <w:b/>
+                <w:sz w:val="18"/>
+              </w:rPr>
+            </w:pPr>
+            <w:r>
+              <w:rPr>
+                <w:rFonts w:ascii="맑은 고딕" w:eastAsia="맑은 고딕"/>
+                <w:b/>
+                <w:noProof/>
+                <w:sz w:val="18"/>
+              </w:rPr>
+              <w:drawing>
+                <wp:inline distT="0" distB="0" distL="0" distR="0" wp14:anchorId="64ED7F89" wp14:editId="44C81D1F">
+                  <wp:extent cx="4141587" cy="2536466"/>
+                  <wp:effectExtent l="0" t="0" r="0" b="0"/>
+                  <wp:docPr id="12" name="그림 12"/>
+                  <wp:cNvGraphicFramePr>
+                    <a:graphicFrameLocks xmlns:a="http://schemas.openxmlformats.org/drawingml/2006/main" noChangeAspect="1"/>
+                  </wp:cNvGraphicFramePr>
+                  <a:graphic xmlns:a="http://schemas.openxmlformats.org/drawingml/2006/main">
+                    <a:graphicData uri="http://schemas.openxmlformats.org/drawingml/2006/picture">
+                      <pic:pic xmlns:pic="http://schemas.openxmlformats.org/drawingml/2006/picture">
+                        <pic:nvPicPr>
+                          <pic:cNvPr id="0" name="Picture 12"/>
+                          <pic:cNvPicPr>
+                            <a:picLocks noChangeAspect="1" noChangeArrowheads="1"/>
+                          </pic:cNvPicPr>
+                        </pic:nvPicPr>
+                        <pic:blipFill>
+                          <a:blip r:embed="rId19">
+                            <a:extLst>
+                              <a:ext uri="{28A0092B-C50C-407E-A947-70E740481C1C}">
+                                <a14:useLocalDpi xmlns:a14="http://schemas.microsoft.com/office/drawing/2010/main" val="0"/>
+                              </a:ext>
+                            </a:extLst>
+                          </a:blip>
+                          <a:srcRect/>
+                          <a:stretch>
+                            <a:fillRect/>
+                          </a:stretch>
+                        </pic:blipFill>
+                        <pic:spPr bwMode="auto">
+                          <a:xfrm>
+                            <a:off x="0" y="0"/>
+                            <a:ext cx="4158546" cy="2546852"/>
+                          </a:xfrm>
+                          <a:prstGeom prst="rect">
+                            <a:avLst/>
+                          </a:prstGeom>
+                          <a:noFill/>
+                          <a:ln>
+                            <a:noFill/>
+                          </a:ln>
+                        </pic:spPr>
+                      </pic:pic>
+                    </a:graphicData>
+                  </a:graphic>
+                </wp:inline>
+              </w:drawing>
+            </w:r>
+          </w:p>
+          <w:p>
+            <w:pPr>
+              <w:pStyle w:val="a3"/>
+              <w:spacing w:line="312" w:lineRule="auto"/>
+              <w:rPr>
+                <w:rFonts w:ascii="맑은 고딕" w:eastAsia="맑은 고딕"/>
+                <w:b/>
+                <w:sz w:val="18"/>
+              </w:rPr>
+            </w:pPr>
+            <w:r>
+              <w:rPr>
+                <w:rFonts w:ascii="맑은 고딕" w:eastAsia="맑은 고딕" w:hint="eastAsia"/>
+                <w:b/>
+                <w:sz w:val="18"/>
+              </w:rPr>
+              <w:t xml:space="preserve">위에서 보면 </w:t>
+            </w:r>
+            <w:r>
+              <w:rPr>
+                <w:rFonts w:ascii="맑은 고딕" w:eastAsia="맑은 고딕"/>
+                <w:b/>
+                <w:sz w:val="18"/>
+              </w:rPr>
+              <w:t xml:space="preserve">D_TRA1_1_SYEAR </w:t>
+            </w:r>
+            <w:r>
+              <w:rPr>
+                <w:rFonts w:ascii="맑은 고딕" w:eastAsia="맑은 고딕" w:hint="eastAsia"/>
+                <w:b/>
+                <w:sz w:val="18"/>
+              </w:rPr>
+              <w:t>이런 식으로 열이 직관적이지 못하게 설정되어 있고 또</w:t>
+            </w:r>
+            <w:r>
+              <w:rPr>
+                <w:rFonts w:ascii="맑은 고딕" w:eastAsia="맑은 고딕"/>
+                <w:b/>
+                <w:sz w:val="18"/>
+              </w:rPr>
+              <w:t xml:space="preserve"> </w:t>
+            </w:r>
+            <w:r>
+              <w:rPr>
+                <w:rFonts w:ascii="맑은 고딕" w:eastAsia="맑은 고딕" w:hint="eastAsia"/>
+                <w:b/>
+                <w:sz w:val="18"/>
+              </w:rPr>
+              <w:t xml:space="preserve">특별이 이 경우에는 위에서 언급한 패턴에 매칭되는 </w:t>
+            </w:r>
+            <w:proofErr w:type="spellStart"/>
+            <w:r>
+              <w:rPr>
+                <w:rFonts w:ascii="맑은 고딕" w:eastAsia="맑은 고딕" w:hint="eastAsia"/>
+                <w:b/>
+                <w:sz w:val="18"/>
+              </w:rPr>
+              <w:t>방문지</w:t>
+            </w:r>
+            <w:proofErr w:type="spellEnd"/>
+            <w:r>
+              <w:rPr>
+                <w:rFonts w:ascii="맑은 고딕" w:eastAsia="맑은 고딕" w:hint="eastAsia"/>
+                <w:b/>
+                <w:sz w:val="18"/>
+              </w:rPr>
+              <w:t xml:space="preserve"> 문항이다.</w:t>
+            </w:r>
+            <w:r>
+              <w:rPr>
+                <w:rFonts w:ascii="맑은 고딕" w:eastAsia="맑은 고딕"/>
+                <w:b/>
+                <w:sz w:val="18"/>
+              </w:rPr>
+              <w:t xml:space="preserve"> </w:t>
+            </w:r>
+            <w:r>
+              <w:rPr>
+                <w:rFonts w:ascii="맑은 고딕" w:eastAsia="맑은 고딕" w:hint="eastAsia"/>
+                <w:b/>
+                <w:sz w:val="18"/>
+              </w:rPr>
+              <w:t xml:space="preserve">오른쪽 아래에 시도 및 </w:t>
+            </w:r>
+            <w:proofErr w:type="spellStart"/>
+            <w:r>
+              <w:rPr>
+                <w:rFonts w:ascii="맑은 고딕" w:eastAsia="맑은 고딕" w:hint="eastAsia"/>
+                <w:b/>
+                <w:sz w:val="18"/>
+              </w:rPr>
+              <w:t>시군구</w:t>
+            </w:r>
+            <w:proofErr w:type="spellEnd"/>
+            <w:r>
+              <w:rPr>
+                <w:rFonts w:ascii="맑은 고딕" w:eastAsia="맑은 고딕" w:hint="eastAsia"/>
+                <w:b/>
+                <w:sz w:val="18"/>
+              </w:rPr>
+              <w:t xml:space="preserve"> 코드,</w:t>
+            </w:r>
+            <w:r>
+              <w:rPr>
+                <w:rFonts w:ascii="맑은 고딕" w:eastAsia="맑은 고딕"/>
+                <w:b/>
+                <w:sz w:val="18"/>
+              </w:rPr>
+              <w:t xml:space="preserve"> </w:t>
+            </w:r>
+            <w:r>
+              <w:rPr>
+                <w:rFonts w:ascii="맑은 고딕" w:eastAsia="맑은 고딕" w:hint="eastAsia"/>
+                <w:b/>
+                <w:sz w:val="18"/>
+              </w:rPr>
+              <w:t xml:space="preserve">숙박시설 코드 등이 데이터가 문자열로 </w:t>
+            </w:r>
+            <w:proofErr w:type="spellStart"/>
+            <w:r>
+              <w:rPr>
+                <w:rFonts w:ascii="맑은 고딕" w:eastAsia="맑은 고딕" w:hint="eastAsia"/>
+                <w:b/>
+                <w:sz w:val="18"/>
+              </w:rPr>
+              <w:t>실제값이</w:t>
+            </w:r>
+            <w:proofErr w:type="spellEnd"/>
+            <w:r>
+              <w:rPr>
+                <w:rFonts w:ascii="맑은 고딕" w:eastAsia="맑은 고딕" w:hint="eastAsia"/>
+                <w:b/>
+                <w:sz w:val="18"/>
+              </w:rPr>
+              <w:t xml:space="preserve"> 기입된 것이 아니라 코드로 기입되어 있기 때문에 각 코드에 대한 </w:t>
+            </w:r>
+            <w:proofErr w:type="spellStart"/>
+            <w:r>
+              <w:rPr>
+                <w:rFonts w:ascii="맑은 고딕" w:eastAsia="맑은 고딕" w:hint="eastAsia"/>
+                <w:b/>
+                <w:sz w:val="18"/>
+              </w:rPr>
+              <w:t>딕셔너리를</w:t>
+            </w:r>
+            <w:proofErr w:type="spellEnd"/>
+            <w:r>
+              <w:rPr>
+                <w:rFonts w:ascii="맑은 고딕" w:eastAsia="맑은 고딕" w:hint="eastAsia"/>
+                <w:b/>
+                <w:sz w:val="18"/>
+              </w:rPr>
+              <w:t xml:space="preserve"> 생성하고 이를 매핑에 활용한 것이다.</w:t>
+            </w:r>
+            <w:r>
+              <w:rPr>
+                <w:rFonts w:ascii="맑은 고딕" w:eastAsia="맑은 고딕"/>
+                <w:b/>
+                <w:sz w:val="18"/>
+              </w:rPr>
+              <w:t xml:space="preserve"> (</w:t>
+            </w:r>
+            <w:r>
+              <w:rPr>
+                <w:rFonts w:ascii="맑은 고딕" w:eastAsia="맑은 고딕" w:hint="eastAsia"/>
+                <w:b/>
+                <w:sz w:val="18"/>
+              </w:rPr>
+              <w:t>특별히 지역 코드의 경우에는 코드 테이블 크기가 너무 커서 G</w:t>
+            </w:r>
+            <w:r>
+              <w:rPr>
+                <w:rFonts w:ascii="맑은 고딕" w:eastAsia="맑은 고딕"/>
+                <w:b/>
+                <w:sz w:val="18"/>
+              </w:rPr>
+              <w:t>PT</w:t>
+            </w:r>
+            <w:r>
+              <w:rPr>
+                <w:rFonts w:ascii="맑은 고딕" w:eastAsia="맑은 고딕" w:hint="eastAsia"/>
+                <w:b/>
+                <w:sz w:val="18"/>
+              </w:rPr>
+              <w:t xml:space="preserve">를 활용해 </w:t>
+            </w:r>
+            <w:r>
+              <w:rPr>
+                <w:rFonts w:ascii="맑은 고딕" w:eastAsia="맑은 고딕"/>
+                <w:b/>
+                <w:sz w:val="18"/>
+              </w:rPr>
+              <w:t xml:space="preserve">json </w:t>
+            </w:r>
+            <w:r>
+              <w:rPr>
+                <w:rFonts w:ascii="맑은 고딕" w:eastAsia="맑은 고딕" w:hint="eastAsia"/>
+                <w:b/>
+                <w:sz w:val="18"/>
+              </w:rPr>
+              <w:t xml:space="preserve">파일을 생성하고 </w:t>
+            </w:r>
+            <w:r>
+              <w:rPr>
+                <w:rFonts w:ascii="맑은 고딕" w:eastAsia="맑은 고딕" w:hint="eastAsia"/>
+                <w:b/>
+                <w:sz w:val="18"/>
+              </w:rPr>
+              <w:lastRenderedPageBreak/>
+              <w:t>j</w:t>
+            </w:r>
+            <w:r>
+              <w:rPr>
+                <w:rFonts w:ascii="맑은 고딕" w:eastAsia="맑은 고딕"/>
+                <w:b/>
+                <w:sz w:val="18"/>
+              </w:rPr>
+              <w:t xml:space="preserve">son </w:t>
+            </w:r>
+            <w:r>
+              <w:rPr>
+                <w:rFonts w:ascii="맑은 고딕" w:eastAsia="맑은 고딕" w:hint="eastAsia"/>
+                <w:b/>
+                <w:sz w:val="18"/>
+              </w:rPr>
+              <w:t xml:space="preserve">모듈을 통해 </w:t>
+            </w:r>
+            <w:proofErr w:type="spellStart"/>
+            <w:r>
+              <w:rPr>
+                <w:rFonts w:ascii="맑은 고딕" w:eastAsia="맑은 고딕" w:hint="eastAsia"/>
+                <w:b/>
+                <w:sz w:val="18"/>
+              </w:rPr>
+              <w:t>딕셔너리로</w:t>
+            </w:r>
+            <w:proofErr w:type="spellEnd"/>
+            <w:r>
+              <w:rPr>
+                <w:rFonts w:ascii="맑은 고딕" w:eastAsia="맑은 고딕" w:hint="eastAsia"/>
+                <w:b/>
+                <w:sz w:val="18"/>
+              </w:rPr>
+              <w:t xml:space="preserve"> </w:t>
+            </w:r>
+            <w:proofErr w:type="spellStart"/>
+            <w:r>
+              <w:rPr>
+                <w:rFonts w:ascii="맑은 고딕" w:eastAsia="맑은 고딕" w:hint="eastAsia"/>
+                <w:b/>
+                <w:sz w:val="18"/>
+              </w:rPr>
+              <w:t>파싱했다</w:t>
+            </w:r>
+            <w:proofErr w:type="spellEnd"/>
+            <w:r>
+              <w:rPr>
+                <w:rFonts w:ascii="맑은 고딕" w:eastAsia="맑은 고딕"/>
+                <w:b/>
+                <w:sz w:val="18"/>
+              </w:rPr>
+              <w:t>.)</w:t>
+            </w:r>
+          </w:p>
+          <w:p>
+            <w:pPr>
+              <w:pStyle w:val="a3"/>
+              <w:spacing w:line="312" w:lineRule="auto"/>
+              <w:rPr>
+                <w:rFonts w:ascii="맑은 고딕" w:eastAsia="맑은 고딕"/>
+                <w:b/>
+                <w:sz w:val="18"/>
+              </w:rPr>
+            </w:pPr>
+          </w:p>
+          <w:p>
+            <w:pPr>
+              <w:pStyle w:val="a3"/>
+              <w:spacing w:line="312" w:lineRule="auto"/>
+              <w:rPr>
+                <w:rFonts w:ascii="맑은 고딕" w:eastAsia="맑은 고딕" w:hint="eastAsia"/>
+                <w:b/>
+                <w:sz w:val="24"/>
+                <w:szCs w:val="24"/>
+              </w:rPr>
+            </w:pPr>
+            <w:r>
+              <w:rPr>
+                <w:rFonts w:ascii="맑은 고딕" w:eastAsia="맑은 고딕" w:hint="eastAsia"/>
+                <w:b/>
+                <w:sz w:val="24"/>
+                <w:szCs w:val="24"/>
+              </w:rPr>
+              <w:t>4</w:t>
+            </w:r>
+            <w:r>
+              <w:rPr>
+                <w:rFonts w:ascii="맑은 고딕" w:eastAsia="맑은 고딕"/>
+                <w:b/>
+                <w:sz w:val="24"/>
+                <w:szCs w:val="24"/>
+              </w:rPr>
+              <w:t xml:space="preserve">) </w:t>
+            </w:r>
+            <w:r>
+              <w:rPr>
+                <w:rFonts w:ascii="맑은 고딕" w:eastAsia="맑은 고딕" w:hint="eastAsia"/>
+                <w:b/>
+                <w:sz w:val="24"/>
+                <w:szCs w:val="24"/>
+              </w:rPr>
+              <w:t xml:space="preserve">부분 데이터 </w:t>
+            </w:r>
+            <w:proofErr w:type="spellStart"/>
+            <w:r>
+              <w:rPr>
+                <w:rFonts w:ascii="맑은 고딕" w:eastAsia="맑은 고딕" w:hint="eastAsia"/>
+                <w:b/>
+                <w:sz w:val="24"/>
+                <w:szCs w:val="24"/>
+              </w:rPr>
+              <w:t>전처리</w:t>
+            </w:r>
+            <w:proofErr w:type="spellEnd"/>
+          </w:p>
+          <w:p>
+            <w:pPr>
+              <w:pStyle w:val="a3"/>
+              <w:spacing w:line="312" w:lineRule="auto"/>
+              <w:rPr>
+                <w:rFonts w:ascii="맑은 고딕" w:eastAsia="맑은 고딕" w:hint="eastAsia"/>
+                <w:b/>
+                <w:sz w:val="18"/>
+              </w:rPr>
+            </w:pPr>
+            <w:r>
+              <w:rPr>
+                <w:rFonts w:ascii="맑은 고딕" w:eastAsia="맑은 고딕" w:hint="eastAsia"/>
+                <w:b/>
+                <w:sz w:val="18"/>
+              </w:rPr>
+              <w:t>3가지 목표</w:t>
+            </w:r>
+            <w:r>
+              <w:rPr>
+                <w:rFonts w:ascii="맑은 고딕" w:eastAsia="맑은 고딕" w:hint="eastAsia"/>
+                <w:b/>
+                <w:sz w:val="18"/>
+              </w:rPr>
+              <w:t>를 위한 데이터를 위해 전처리를 했다.</w:t>
+            </w:r>
+            <w:r>
+              <w:rPr>
+                <w:rFonts w:ascii="맑은 고딕" w:eastAsia="맑은 고딕"/>
+                <w:b/>
+                <w:sz w:val="18"/>
+              </w:rPr>
+              <w:t xml:space="preserve"> </w:t>
+            </w:r>
+            <w:r>
+              <w:rPr>
+                <w:rFonts w:ascii="맑은 고딕" w:eastAsia="맑은 고딕" w:hint="eastAsia"/>
+                <w:b/>
+                <w:sz w:val="18"/>
+              </w:rPr>
+              <w:t>우선 필요한 열이 없는 행을 삭제하고</w:t>
+            </w:r>
+            <w:r>
+              <w:rPr>
+                <w:rFonts w:ascii="맑은 고딕" w:eastAsia="맑은 고딕"/>
+                <w:b/>
+                <w:sz w:val="18"/>
+              </w:rPr>
+              <w:t xml:space="preserve"> </w:t>
+            </w:r>
+            <w:r>
+              <w:rPr>
+                <w:rFonts w:ascii="맑은 고딕" w:eastAsia="맑은 고딕" w:hint="eastAsia"/>
+                <w:b/>
+                <w:sz w:val="18"/>
+              </w:rPr>
+              <w:t>복합키에 대해 중복을 없앴다.</w:t>
+            </w:r>
+            <w:r>
+              <w:rPr>
+                <w:rFonts w:ascii="맑은 고딕" w:eastAsia="맑은 고딕"/>
+                <w:b/>
+                <w:sz w:val="18"/>
+              </w:rPr>
+              <w:t xml:space="preserve"> </w:t>
+            </w:r>
+            <w:r>
+              <w:rPr>
+                <w:rFonts w:ascii="맑은 고딕" w:eastAsia="맑은 고딕" w:hint="eastAsia"/>
+                <w:b/>
+                <w:sz w:val="18"/>
+              </w:rPr>
+              <w:t xml:space="preserve">나이대에 따른 여행 방문 지역이나 혼인 상태에 따른 여행 방문 지역은 </w:t>
+            </w:r>
+            <w:r>
+              <w:rPr>
+                <w:rFonts w:ascii="맑은 고딕" w:eastAsia="맑은 고딕"/>
+                <w:b/>
+                <w:sz w:val="18"/>
+              </w:rPr>
+              <w:t xml:space="preserve">ID, </w:t>
+            </w:r>
+            <w:proofErr w:type="spellStart"/>
+            <w:r>
+              <w:rPr>
+                <w:rFonts w:ascii="맑은 고딕" w:eastAsia="맑은 고딕" w:hint="eastAsia"/>
+                <w:b/>
+                <w:sz w:val="18"/>
+              </w:rPr>
+              <w:t>여행차수</w:t>
+            </w:r>
+            <w:proofErr w:type="spellEnd"/>
+            <w:r>
+              <w:rPr>
+                <w:rFonts w:ascii="맑은 고딕" w:eastAsia="맑은 고딕" w:hint="eastAsia"/>
+                <w:b/>
+                <w:sz w:val="18"/>
+              </w:rPr>
+              <w:t>,</w:t>
+            </w:r>
+            <w:r>
+              <w:rPr>
+                <w:rFonts w:ascii="맑은 고딕" w:eastAsia="맑은 고딕"/>
+                <w:b/>
+                <w:sz w:val="18"/>
+              </w:rPr>
+              <w:t xml:space="preserve"> </w:t>
+            </w:r>
+            <w:r>
+              <w:rPr>
+                <w:rFonts w:ascii="맑은 고딕" w:eastAsia="맑은 고딕" w:hint="eastAsia"/>
+                <w:b/>
+                <w:sz w:val="18"/>
+              </w:rPr>
+              <w:t>방문지역코드를 복합키로 설정해서 같은 사람이 같은 여행에서 방문한 서로 다른 지역을 식별할 수 있다.</w:t>
+            </w:r>
+            <w:r>
+              <w:rPr>
+                <w:rFonts w:ascii="맑은 고딕" w:eastAsia="맑은 고딕"/>
+                <w:b/>
+                <w:sz w:val="18"/>
+              </w:rPr>
+              <w:t xml:space="preserve"> </w:t>
+            </w:r>
+            <w:r>
+              <w:rPr>
+                <w:rFonts w:ascii="맑은 고딕" w:eastAsia="맑은 고딕" w:hint="eastAsia"/>
+                <w:b/>
+                <w:sz w:val="18"/>
+              </w:rPr>
+              <w:t>월별 방문 지역의 경우에는 이에 방문월을 추가해서 같은 사람이 두 달(혹은 여러 달)을 걸쳐서 여행한 경우에 서로 다른 달에 같은 지역을 방문한 것을 서로 다르게 식별할 수 있다.</w:t>
+            </w:r>
+            <w:r>
+              <w:rPr>
+                <w:rFonts w:ascii="맑은 고딕" w:eastAsia="맑은 고딕"/>
+                <w:b/>
+                <w:sz w:val="18"/>
+              </w:rPr>
+              <w:t xml:space="preserve"> </w:t>
+            </w:r>
+            <w:r>
+              <w:rPr>
+                <w:rFonts w:ascii="맑은 고딕" w:eastAsia="맑은 고딕" w:hint="eastAsia"/>
+                <w:b/>
+                <w:sz w:val="18"/>
+              </w:rPr>
+              <w:t xml:space="preserve">후에 </w:t>
+            </w:r>
+            <w:proofErr w:type="spellStart"/>
+            <w:r>
+              <w:rPr>
+                <w:rFonts w:ascii="맑은 고딕" w:eastAsia="맑은 고딕" w:hint="eastAsia"/>
+                <w:b/>
+                <w:sz w:val="18"/>
+              </w:rPr>
+              <w:t>g</w:t>
+            </w:r>
+            <w:r>
+              <w:rPr>
+                <w:rFonts w:ascii="맑은 고딕" w:eastAsia="맑은 고딕"/>
+                <w:b/>
+                <w:sz w:val="18"/>
+              </w:rPr>
+              <w:t>roupby</w:t>
+            </w:r>
+            <w:proofErr w:type="spellEnd"/>
+            <w:r>
+              <w:rPr>
+                <w:rFonts w:ascii="맑은 고딕" w:eastAsia="맑은 고딕"/>
+                <w:b/>
+                <w:sz w:val="18"/>
+              </w:rPr>
+              <w:t>() + size()</w:t>
+            </w:r>
+            <w:r>
+              <w:rPr>
+                <w:rFonts w:ascii="맑은 고딕" w:eastAsia="맑은 고딕" w:hint="eastAsia"/>
+                <w:b/>
+                <w:sz w:val="18"/>
+              </w:rPr>
+              <w:t>를 통해 특정 지표에 따른 방문 수를 집계한다</w:t>
+            </w:r>
+            <w:r>
+              <w:rPr>
+                <w:rFonts w:ascii="맑은 고딕" w:eastAsia="맑은 고딕" w:hint="eastAsia"/>
+                <w:b/>
+                <w:sz w:val="18"/>
+              </w:rPr>
+              <w:t>(연령대,</w:t>
+            </w:r>
+            <w:r>
+              <w:rPr>
+                <w:rFonts w:ascii="맑은 고딕" w:eastAsia="맑은 고딕"/>
+                <w:b/>
+                <w:sz w:val="18"/>
+              </w:rPr>
+              <w:t xml:space="preserve"> </w:t>
+            </w:r>
+            <w:r>
+              <w:rPr>
+                <w:rFonts w:ascii="맑은 고딕" w:eastAsia="맑은 고딕" w:hint="eastAsia"/>
+                <w:b/>
+                <w:sz w:val="18"/>
+              </w:rPr>
+              <w:t>방문지역에 대한 방문 수,</w:t>
+            </w:r>
+            <w:r>
+              <w:rPr>
+                <w:rFonts w:ascii="맑은 고딕" w:eastAsia="맑은 고딕"/>
+                <w:b/>
+                <w:sz w:val="18"/>
+              </w:rPr>
+              <w:t xml:space="preserve"> </w:t>
+            </w:r>
+            <w:proofErr w:type="spellStart"/>
+            <w:r>
+              <w:rPr>
+                <w:rFonts w:ascii="맑은 고딕" w:eastAsia="맑은 고딕" w:hint="eastAsia"/>
+                <w:b/>
+                <w:sz w:val="18"/>
+              </w:rPr>
+              <w:t>방문월</w:t>
+            </w:r>
+            <w:proofErr w:type="spellEnd"/>
+            <w:r>
+              <w:rPr>
+                <w:rFonts w:ascii="맑은 고딕" w:eastAsia="맑은 고딕" w:hint="eastAsia"/>
+                <w:b/>
+                <w:sz w:val="18"/>
+              </w:rPr>
+              <w:t>,</w:t>
+            </w:r>
+            <w:r>
+              <w:rPr>
+                <w:rFonts w:ascii="맑은 고딕" w:eastAsia="맑은 고딕"/>
+                <w:b/>
+                <w:sz w:val="18"/>
+              </w:rPr>
+              <w:t xml:space="preserve"> </w:t>
+            </w:r>
+            <w:r>
+              <w:rPr>
+                <w:rFonts w:ascii="맑은 고딕" w:eastAsia="맑은 고딕" w:hint="eastAsia"/>
+                <w:b/>
+                <w:sz w:val="18"/>
+              </w:rPr>
+              <w:t>방문지역에 대한 방문 수,</w:t>
+            </w:r>
+            <w:r>
+              <w:rPr>
+                <w:rFonts w:ascii="맑은 고딕" w:eastAsia="맑은 고딕"/>
+                <w:b/>
+                <w:sz w:val="18"/>
+              </w:rPr>
+              <w:t xml:space="preserve"> </w:t>
+            </w:r>
+            <w:r>
+              <w:rPr>
+                <w:rFonts w:ascii="맑은 고딕" w:eastAsia="맑은 고딕" w:hint="eastAsia"/>
+                <w:b/>
+                <w:sz w:val="18"/>
+              </w:rPr>
+              <w:t>결혼상태,</w:t>
+            </w:r>
+            <w:r>
+              <w:rPr>
+                <w:rFonts w:ascii="맑은 고딕" w:eastAsia="맑은 고딕"/>
+                <w:b/>
+                <w:sz w:val="18"/>
+              </w:rPr>
+              <w:t xml:space="preserve"> </w:t>
+            </w:r>
+            <w:r>
+              <w:rPr>
+                <w:rFonts w:ascii="맑은 고딕" w:eastAsia="맑은 고딕" w:hint="eastAsia"/>
+                <w:b/>
+                <w:sz w:val="18"/>
+              </w:rPr>
+              <w:t>방문지역에 대한 방문 수 등)</w:t>
+            </w:r>
+            <w:r>
+              <w:rPr>
+                <w:rFonts w:ascii="맑은 고딕" w:eastAsia="맑은 고딕" w:hint="eastAsia"/>
+                <w:b/>
+                <w:sz w:val="18"/>
+              </w:rPr>
+              <w:t>.</w:t>
+            </w:r>
+            <w:r>
+              <w:rPr>
+                <w:rFonts w:ascii="맑은 고딕" w:eastAsia="맑은 고딕"/>
+                <w:b/>
+                <w:sz w:val="18"/>
+              </w:rPr>
+              <w:t xml:space="preserve"> </w:t>
+            </w:r>
+            <w:r>
+              <w:rPr>
+                <w:rFonts w:ascii="맑은 고딕" w:eastAsia="맑은 고딕" w:hint="eastAsia"/>
+                <w:b/>
+                <w:sz w:val="18"/>
+              </w:rPr>
+              <w:t xml:space="preserve">이를 </w:t>
+            </w:r>
+            <w:r>
+              <w:rPr>
+                <w:rFonts w:ascii="맑은 고딕" w:eastAsia="맑은 고딕"/>
+                <w:b/>
+                <w:sz w:val="18"/>
+              </w:rPr>
+              <w:t>merge()</w:t>
+            </w:r>
+            <w:r>
+              <w:rPr>
+                <w:rFonts w:ascii="맑은 고딕" w:eastAsia="맑은 고딕" w:hint="eastAsia"/>
+                <w:b/>
+                <w:sz w:val="18"/>
+              </w:rPr>
+              <w:t xml:space="preserve">를 통해 조인함으로 데이터를 </w:t>
+            </w:r>
+            <w:proofErr w:type="spellStart"/>
+            <w:r>
+              <w:rPr>
+                <w:rFonts w:ascii="맑은 고딕" w:eastAsia="맑은 고딕" w:hint="eastAsia"/>
+                <w:b/>
+                <w:sz w:val="18"/>
+              </w:rPr>
+              <w:t>전처리할</w:t>
+            </w:r>
+            <w:proofErr w:type="spellEnd"/>
+            <w:r>
+              <w:rPr>
+                <w:rFonts w:ascii="맑은 고딕" w:eastAsia="맑은 고딕" w:hint="eastAsia"/>
+                <w:b/>
+                <w:sz w:val="18"/>
+              </w:rPr>
+              <w:t xml:space="preserve"> 수 있다.</w:t>
+            </w:r>
+          </w:p>
+          <w:p>
+            <w:pPr>
+              <w:pStyle w:val="a3"/>
+              <w:spacing w:line="312" w:lineRule="auto"/>
+              <w:rPr>
+                <w:rFonts w:ascii="맑은 고딕" w:eastAsia="맑은 고딕" w:hint="eastAsia"/>
+                <w:b/>
+                <w:sz w:val="18"/>
+              </w:rPr>
+            </w:pPr>
+            <w:r>
+              <w:rPr>
+                <w:rFonts w:ascii="맑은 고딕" w:eastAsia="맑은 고딕"/>
+                <w:b/>
+                <w:noProof/>
+                <w:sz w:val="18"/>
+              </w:rPr>
+              <w:drawing>
+                <wp:inline distT="0" distB="0" distL="0" distR="0" wp14:anchorId="246F557C" wp14:editId="288AB280">
+                  <wp:extent cx="3411109" cy="2512299"/>
+                  <wp:effectExtent l="0" t="0" r="0" b="2540"/>
+                  <wp:docPr id="13" name="그림 13"/>
+                  <wp:cNvGraphicFramePr>
+                    <a:graphicFrameLocks xmlns:a="http://schemas.openxmlformats.org/drawingml/2006/main" noChangeAspect="1"/>
+                  </wp:cNvGraphicFramePr>
+                  <a:graphic xmlns:a="http://schemas.openxmlformats.org/drawingml/2006/main">
+                    <a:graphicData uri="http://schemas.openxmlformats.org/drawingml/2006/picture">
+                      <pic:pic xmlns:pic="http://schemas.openxmlformats.org/drawingml/2006/picture">
+                        <pic:nvPicPr>
+                          <pic:cNvPr id="0" name="Picture 13"/>
+                          <pic:cNvPicPr>
+                            <a:picLocks noChangeAspect="1" noChangeArrowheads="1"/>
+                          </pic:cNvPicPr>
+                        </pic:nvPicPr>
+                        <pic:blipFill>
+                          <a:blip r:embed="rId20">
+                            <a:extLst>
+                              <a:ext uri="{28A0092B-C50C-407E-A947-70E740481C1C}">
+                                <a14:useLocalDpi xmlns:a14="http://schemas.microsoft.com/office/drawing/2010/main" val="0"/>
+                              </a:ext>
+                            </a:extLst>
+                          </a:blip>
+                          <a:srcRect/>
+                          <a:stretch>
+                            <a:fillRect/>
+                          </a:stretch>
+                        </pic:blipFill>
+                        <pic:spPr bwMode="auto">
+                          <a:xfrm>
+                            <a:off x="0" y="0"/>
+                            <a:ext cx="3419537" cy="2518506"/>
+                          </a:xfrm>
+                          <a:prstGeom prst="rect">
+                            <a:avLst/>
+                          </a:prstGeom>
+                          <a:noFill/>
+                          <a:ln>
+                            <a:noFill/>
+                          </a:ln>
+                        </pic:spPr>
+                      </pic:pic>
+                    </a:graphicData>
+                  </a:graphic>
+                </wp:inline>
+              </w:drawing>
+            </w:r>
+          </w:p>
+          <w:p>
+            <w:pPr>
+              <w:pStyle w:val="a3"/>
+              <w:spacing w:line="312" w:lineRule="auto"/>
+              <w:rPr>
+                <w:rFonts w:ascii="맑은 고딕" w:eastAsia="맑은 고딕"/>
+                <w:b/>
+                <w:sz w:val="18"/>
+              </w:rPr>
+            </w:pPr>
+            <w:r>
+              <w:rPr>
+                <w:rFonts w:ascii="맑은 고딕" w:eastAsia="맑은 고딕" w:hint="eastAsia"/>
+                <w:b/>
+                <w:sz w:val="18"/>
+              </w:rPr>
+              <w:t xml:space="preserve">위는 </w:t>
+            </w:r>
+            <w:proofErr w:type="spellStart"/>
+            <w:r>
+              <w:rPr>
+                <w:rFonts w:ascii="맑은 고딕" w:eastAsia="맑은 고딕" w:hint="eastAsia"/>
+                <w:b/>
+                <w:sz w:val="18"/>
+              </w:rPr>
+              <w:t>전처리</w:t>
+            </w:r>
+            <w:proofErr w:type="spellEnd"/>
+            <w:r>
+              <w:rPr>
+                <w:rFonts w:ascii="맑은 고딕" w:eastAsia="맑은 고딕" w:hint="eastAsia"/>
+                <w:b/>
+                <w:sz w:val="18"/>
+              </w:rPr>
+              <w:t xml:space="preserve"> 후의 데이터 예시이다.</w:t>
+            </w:r>
+          </w:p>
+          <w:p>
+            <w:pPr>
+              <w:pStyle w:val="a3"/>
+              <w:spacing w:line="312" w:lineRule="auto"/>
+              <w:rPr>
+                <w:rFonts w:ascii="맑은 고딕" w:eastAsia="맑은 고딕"/>
+                <w:b/>
+                <w:sz w:val="18"/>
+              </w:rPr>
+            </w:pPr>
+          </w:p>
+          <w:p>
+            <w:pPr>
+              <w:pStyle w:val="a3"/>
+              <w:spacing w:line="312" w:lineRule="auto"/>
+              <w:rPr>
+                <w:rFonts w:ascii="맑은 고딕" w:eastAsia="맑은 고딕"/>
+                <w:b/>
+                <w:sz w:val="18"/>
+              </w:rPr>
+            </w:pPr>
+            <w:r>
+              <w:rPr>
+                <w:rFonts w:ascii="맑은 고딕" w:eastAsia="맑은 고딕" w:hint="eastAsia"/>
+                <w:b/>
+                <w:sz w:val="18"/>
+              </w:rPr>
+              <w:t>5</w:t>
+            </w:r>
+            <w:r>
+              <w:rPr>
+                <w:rFonts w:ascii="맑은 고딕" w:eastAsia="맑은 고딕"/>
+                <w:b/>
+                <w:sz w:val="18"/>
+              </w:rPr>
+              <w:t xml:space="preserve">) </w:t>
+            </w:r>
+            <w:r>
+              <w:rPr>
+                <w:rFonts w:ascii="맑은 고딕" w:eastAsia="맑은 고딕" w:hint="eastAsia"/>
+                <w:b/>
+                <w:sz w:val="18"/>
+              </w:rPr>
+              <w:t>데이터 시각화</w:t>
+            </w:r>
+          </w:p>
+          <w:p>
+            <w:pPr>
+              <w:pStyle w:val="a3"/>
+              <w:spacing w:line="312" w:lineRule="auto"/>
+              <w:rPr>
+                <w:rFonts w:ascii="맑은 고딕" w:eastAsia="맑은 고딕" w:hint="eastAsia"/>
+                <w:b/>
+                <w:sz w:val="18"/>
+              </w:rPr>
+            </w:pPr>
+            <w:r>
+              <w:rPr>
+                <w:rFonts w:ascii="맑은 고딕" w:eastAsia="맑은 고딕" w:hint="eastAsia"/>
+                <w:b/>
+                <w:sz w:val="18"/>
+              </w:rPr>
+              <w:t xml:space="preserve">전처리한 데이터는 모두 </w:t>
+            </w:r>
+            <w:r>
+              <w:rPr>
+                <w:rFonts w:ascii="맑은 고딕" w:eastAsia="맑은 고딕"/>
+                <w:b/>
+                <w:sz w:val="18"/>
+              </w:rPr>
+              <w:t>[</w:t>
+            </w:r>
+            <w:r>
+              <w:rPr>
+                <w:rFonts w:ascii="맑은 고딕" w:eastAsia="맑은 고딕" w:hint="eastAsia"/>
+                <w:b/>
+                <w:sz w:val="18"/>
+              </w:rPr>
+              <w:t>원하는 정보]</w:t>
+            </w:r>
+            <w:r>
+              <w:rPr>
+                <w:rFonts w:ascii="맑은 고딕" w:eastAsia="맑은 고딕"/>
+                <w:b/>
+                <w:sz w:val="18"/>
+              </w:rPr>
+              <w:t xml:space="preserve">, </w:t>
+            </w:r>
+            <w:r>
+              <w:rPr>
+                <w:rFonts w:ascii="맑은 고딕" w:eastAsia="맑은 고딕" w:hint="eastAsia"/>
+                <w:b/>
+                <w:sz w:val="18"/>
+              </w:rPr>
+              <w:t>방문지역,</w:t>
+            </w:r>
+            <w:r>
+              <w:rPr>
+                <w:rFonts w:ascii="맑은 고딕" w:eastAsia="맑은 고딕"/>
+                <w:b/>
+                <w:sz w:val="18"/>
+              </w:rPr>
+              <w:t xml:space="preserve"> </w:t>
+            </w:r>
+            <w:r>
+              <w:rPr>
+                <w:rFonts w:ascii="맑은 고딕" w:eastAsia="맑은 고딕" w:hint="eastAsia"/>
+                <w:b/>
+                <w:sz w:val="18"/>
+              </w:rPr>
+              <w:t>방문여행건수,</w:t>
+            </w:r>
+            <w:r>
+              <w:rPr>
+                <w:rFonts w:ascii="맑은 고딕" w:eastAsia="맑은 고딕"/>
+                <w:b/>
+                <w:sz w:val="18"/>
+              </w:rPr>
+              <w:t xml:space="preserve"> </w:t>
+            </w:r>
+            <w:r>
+              <w:rPr>
+                <w:rFonts w:ascii="맑은 고딕" w:eastAsia="맑은 고딕" w:hint="eastAsia"/>
+                <w:b/>
+                <w:sz w:val="18"/>
+              </w:rPr>
+              <w:t>전체여행건수,</w:t>
+            </w:r>
+            <w:r>
+              <w:rPr>
+                <w:rFonts w:ascii="맑은 고딕" w:eastAsia="맑은 고딕"/>
+                <w:b/>
+                <w:sz w:val="18"/>
+              </w:rPr>
+              <w:t xml:space="preserve"> </w:t>
+            </w:r>
+            <w:r>
+              <w:rPr>
+                <w:rFonts w:ascii="맑은 고딕" w:eastAsia="맑은 고딕" w:hint="eastAsia"/>
+                <w:b/>
+                <w:sz w:val="18"/>
+              </w:rPr>
+              <w:t>지역방문율 이렇게 열로 가지는 데이터프레임이다</w:t>
+            </w:r>
+            <w:r>
+              <w:rPr>
+                <w:rFonts w:ascii="맑은 고딕" w:eastAsia="맑은 고딕"/>
+                <w:b/>
+                <w:sz w:val="18"/>
+              </w:rPr>
+              <w:t xml:space="preserve">. </w:t>
+            </w:r>
+            <w:r>
+              <w:rPr>
+                <w:rFonts w:ascii="맑은 고딕" w:eastAsia="맑은 고딕" w:hint="eastAsia"/>
+                <w:b/>
+                <w:sz w:val="18"/>
+              </w:rPr>
+              <w:t xml:space="preserve">이를 </w:t>
+            </w:r>
+            <w:r>
+              <w:rPr>
+                <w:rFonts w:ascii="맑은 고딕" w:eastAsia="맑은 고딕"/>
+                <w:b/>
+                <w:sz w:val="18"/>
+              </w:rPr>
+              <w:t>[</w:t>
+            </w:r>
+            <w:r>
+              <w:rPr>
+                <w:rFonts w:ascii="맑은 고딕" w:eastAsia="맑은 고딕" w:hint="eastAsia"/>
+                <w:b/>
+                <w:sz w:val="18"/>
+              </w:rPr>
+              <w:t>원하는 정보]</w:t>
+            </w:r>
+            <w:r>
+              <w:rPr>
+                <w:rFonts w:ascii="맑은 고딕" w:eastAsia="맑은 고딕"/>
+                <w:b/>
+                <w:sz w:val="18"/>
+              </w:rPr>
+              <w:t xml:space="preserve">, </w:t>
+            </w:r>
+            <w:r>
+              <w:rPr>
+                <w:rFonts w:ascii="맑은 고딕" w:eastAsia="맑은 고딕" w:hint="eastAsia"/>
+                <w:b/>
+                <w:sz w:val="18"/>
+              </w:rPr>
+              <w:t>방문여행건수,</w:t>
+            </w:r>
+            <w:r>
+              <w:rPr>
+                <w:rFonts w:ascii="맑은 고딕" w:eastAsia="맑은 고딕"/>
+                <w:b/>
+                <w:sz w:val="18"/>
+              </w:rPr>
+              <w:t xml:space="preserve"> </w:t>
+            </w:r>
+            <w:r>
+              <w:rPr>
+                <w:rFonts w:ascii="맑은 고딕" w:eastAsia="맑은 고딕" w:hint="eastAsia"/>
+                <w:b/>
+                <w:sz w:val="18"/>
+              </w:rPr>
+              <w:t xml:space="preserve">방문지역 순서대로 정렬하고 </w:t>
+            </w:r>
+            <w:r>
+              <w:rPr>
+                <w:rFonts w:ascii="맑은 고딕" w:eastAsia="맑은 고딕"/>
+                <w:b/>
+                <w:sz w:val="18"/>
+              </w:rPr>
+              <w:t>[</w:t>
+            </w:r>
+            <w:r>
+              <w:rPr>
+                <w:rFonts w:ascii="맑은 고딕" w:eastAsia="맑은 고딕" w:hint="eastAsia"/>
+                <w:b/>
+                <w:sz w:val="18"/>
+              </w:rPr>
+              <w:t xml:space="preserve">원하는 정보]로 </w:t>
+            </w:r>
+            <w:proofErr w:type="spellStart"/>
+            <w:r>
+              <w:rPr>
+                <w:rFonts w:ascii="맑은 고딕" w:eastAsia="맑은 고딕"/>
+                <w:b/>
+                <w:sz w:val="18"/>
+              </w:rPr>
+              <w:t>groupby</w:t>
+            </w:r>
+            <w:proofErr w:type="spellEnd"/>
+            <w:r>
+              <w:rPr>
+                <w:rFonts w:ascii="맑은 고딕" w:eastAsia="맑은 고딕"/>
+                <w:b/>
+                <w:sz w:val="18"/>
+              </w:rPr>
+              <w:t>()</w:t>
+            </w:r>
+            <w:r>
+              <w:rPr>
+                <w:rFonts w:ascii="맑은 고딕" w:eastAsia="맑은 고딕"/>
+                <w:b/>
+                <w:sz w:val="18"/>
+              </w:rPr>
+              <w:t xml:space="preserve"> </w:t>
+            </w:r>
+            <w:r>
+              <w:rPr>
+                <w:rFonts w:ascii="맑은 고딕" w:eastAsia="맑은 고딕" w:hint="eastAsia"/>
+                <w:b/>
+                <w:sz w:val="18"/>
+              </w:rPr>
+              <w:t xml:space="preserve">및 </w:t>
+            </w:r>
+            <w:r>
+              <w:rPr>
+                <w:rFonts w:ascii="맑은 고딕" w:eastAsia="맑은 고딕"/>
+                <w:b/>
+                <w:sz w:val="18"/>
+              </w:rPr>
+              <w:t>head()</w:t>
+            </w:r>
+            <w:r>
+              <w:rPr>
+                <w:rFonts w:ascii="맑은 고딕" w:eastAsia="맑은 고딕" w:hint="eastAsia"/>
+                <w:b/>
+                <w:sz w:val="18"/>
+              </w:rPr>
+              <w:t xml:space="preserve">하여 </w:t>
+            </w:r>
+            <w:r>
+              <w:rPr>
+                <w:rFonts w:ascii="맑은 고딕" w:eastAsia="맑은 고딕" w:hint="eastAsia"/>
+                <w:b/>
+                <w:sz w:val="18"/>
+              </w:rPr>
+              <w:t xml:space="preserve">[원하는 정보]에 따른 방문여행건수 상위 </w:t>
+            </w:r>
+            <w:r>
+              <w:rPr>
+                <w:rFonts w:ascii="맑은 고딕" w:eastAsia="맑은 고딕"/>
+                <w:b/>
+                <w:sz w:val="18"/>
+              </w:rPr>
+              <w:t>5</w:t>
+            </w:r>
+            <w:r>
+              <w:rPr>
+                <w:rFonts w:ascii="맑은 고딕" w:eastAsia="맑은 고딕" w:hint="eastAsia"/>
+                <w:b/>
+                <w:sz w:val="18"/>
+              </w:rPr>
+              <w:t>개 행을 가져온다.</w:t>
+            </w:r>
+            <w:r>
+              <w:rPr>
+                <w:rFonts w:ascii="맑은 고딕" w:eastAsia="맑은 고딕"/>
+                <w:b/>
+                <w:sz w:val="18"/>
+              </w:rPr>
+              <w:t xml:space="preserve"> </w:t>
+            </w:r>
+            <w:r>
+              <w:rPr>
+                <w:rFonts w:ascii="맑은 고딕" w:eastAsia="맑은 고딕" w:hint="eastAsia"/>
+                <w:b/>
+                <w:sz w:val="18"/>
+              </w:rPr>
+              <w:t xml:space="preserve">이를 </w:t>
+            </w:r>
+            <w:r>
+              <w:rPr>
+                <w:rFonts w:ascii="맑은 고딕" w:eastAsia="맑은 고딕"/>
+                <w:b/>
+                <w:sz w:val="18"/>
+              </w:rPr>
+              <w:t>[</w:t>
+            </w:r>
+            <w:r>
+              <w:rPr>
+                <w:rFonts w:ascii="맑은 고딕" w:eastAsia="맑은 고딕" w:hint="eastAsia"/>
+                <w:b/>
+                <w:sz w:val="18"/>
+              </w:rPr>
+              <w:t xml:space="preserve">원하는 정보]와 방문여행건수 이렇게 두 축이 있으므로 </w:t>
+            </w:r>
+            <w:proofErr w:type="spellStart"/>
+            <w:r>
+              <w:rPr>
+                <w:rFonts w:ascii="맑은 고딕" w:eastAsia="맑은 고딕"/>
+                <w:b/>
+                <w:sz w:val="18"/>
+              </w:rPr>
+              <w:t>plt</w:t>
+            </w:r>
+            <w:proofErr w:type="spellEnd"/>
+            <w:r>
+              <w:rPr>
+                <w:rFonts w:ascii="맑은 고딕" w:eastAsia="맑은 고딕" w:hint="eastAsia"/>
+                <w:b/>
+                <w:sz w:val="18"/>
+              </w:rPr>
+              <w:t>를 통해 가로 막대 그래프로 표현할 수 있다.</w:t>
+            </w:r>
+          </w:p>
+          <w:p>
+            <w:pPr>
+              <w:pStyle w:val="a3"/>
+              <w:spacing w:line="312" w:lineRule="auto"/>
+              <w:rPr>
+                <w:rFonts w:ascii="맑은 고딕" w:eastAsia="맑은 고딕"/>
+                <w:b/>
+                <w:sz w:val="18"/>
+              </w:rPr>
+            </w:pPr>
+            <w:r>
+              <w:rPr>
+                <w:rFonts w:ascii="맑은 고딕" w:eastAsia="맑은 고딕"/>
+                <w:b/>
+                <w:sz w:val="18"/>
+              </w:rPr>
+              <w:lastRenderedPageBreak/>
+              <w:drawing>
+                <wp:inline distT="0" distB="0" distL="0" distR="0" wp14:anchorId="0BF9F9B3" wp14:editId="0FECF86F">
+                  <wp:extent cx="6158230" cy="3608070"/>
+                  <wp:effectExtent l="0" t="0" r="0" b="0"/>
+                  <wp:docPr id="14" name="그림 14"/>
+                  <wp:cNvGraphicFramePr>
+                    <a:graphicFrameLocks xmlns:a="http://schemas.openxmlformats.org/drawingml/2006/main" noChangeAspect="1"/>
+                  </wp:cNvGraphicFramePr>
+                  <a:graphic xmlns:a="http://schemas.openxmlformats.org/drawingml/2006/main">
+                    <a:graphicData uri="http://schemas.openxmlformats.org/drawingml/2006/picture">
+                      <pic:pic xmlns:pic="http://schemas.openxmlformats.org/drawingml/2006/picture">
+                        <pic:nvPicPr>
+                          <pic:cNvPr id="1" name=""/>
+                          <pic:cNvPicPr/>
+                        </pic:nvPicPr>
+                        <pic:blipFill>
+                          <a:blip r:embed="rId21"/>
+                          <a:stretch>
+                            <a:fillRect/>
+                          </a:stretch>
+                        </pic:blipFill>
+                        <pic:spPr>
+                          <a:xfrm>
+                            <a:off x="0" y="0"/>
+                            <a:ext cx="6158230" cy="3608070"/>
+                          </a:xfrm>
+                          <a:prstGeom prst="rect">
+                            <a:avLst/>
+                          </a:prstGeom>
+                        </pic:spPr>
+                      </pic:pic>
+                    </a:graphicData>
+                  </a:graphic>
+                </wp:inline>
+              </w:drawing>
+            </w:r>
+          </w:p>
+          <w:p>
+            <w:pPr>
+              <w:pStyle w:val="a3"/>
+              <w:spacing w:line="312" w:lineRule="auto"/>
+              <w:rPr>
+                <w:rFonts w:ascii="맑은 고딕" w:eastAsia="맑은 고딕"/>
+                <w:b/>
+                <w:sz w:val="18"/>
+              </w:rPr>
+            </w:pPr>
+            <w:r>
+              <w:rPr>
+                <w:rFonts w:ascii="맑은 고딕" w:eastAsia="맑은 고딕" w:hint="eastAsia"/>
+                <w:b/>
+                <w:sz w:val="18"/>
+              </w:rPr>
+              <w:t>위는 그 예시이다.</w:t>
+            </w:r>
+          </w:p>
+          <w:p>
+            <w:pPr>
+              <w:pStyle w:val="a3"/>
+              <w:spacing w:line="312" w:lineRule="auto"/>
+              <w:rPr>
+                <w:rFonts w:ascii="맑은 고딕" w:eastAsia="맑은 고딕"/>
+                <w:b/>
+                <w:sz w:val="18"/>
+              </w:rPr>
+            </w:pPr>
+          </w:p>
+          <w:p>
+            <w:pPr>
+              <w:pStyle w:val="a3"/>
+              <w:spacing w:line="312" w:lineRule="auto"/>
+              <w:rPr>
+                <w:rFonts w:ascii="맑은 고딕" w:eastAsia="맑은 고딕" w:hint="eastAsia"/>
                 <w:b/>
                 <w:sz w:val="18"/>
               </w:rPr>
@@ -8999,7 +11397,6 @@
         <w:tc>
           <w:tcPr>
             <w:tcW w:w="9902" w:type="dxa"/>
-            <w:gridSpan w:val="3"/>
           </w:tcPr>
           <w:p>
             <w:pPr>
@@ -9021,7 +11418,7 @@
       </w:pPr>
     </w:p>
     <w:sectPr>
-      <w:headerReference w:type="default" r:id="rId16"/>
+      <w:headerReference w:type="default" r:id="rId22"/>
       <w:endnotePr>
         <w:numFmt w:val="decimal"/>
       </w:endnotePr>
@@ -9377,6 +11774,95 @@
     </w:lvl>
   </w:abstractNum>
   <w:abstractNum w:abstractNumId="3" w15:restartNumberingAfterBreak="0">
+    <w:nsid w:val="13BE04DA"/>
+    <w:multiLevelType w:val="hybridMultilevel"/>
+    <w:tmpl w:val="BBCE5606"/>
+    <w:lvl w:ilvl="0" w:tplc="6FB6F91E">
+      <w:start w:val="1"/>
+      <w:numFmt w:val="lowerLetter"/>
+      <w:lvlText w:val="%1)"/>
+      <w:lvlJc w:val="left"/>
+      <w:pPr>
+        <w:ind w:left="760" w:hanging="360"/>
+      </w:pPr>
+      <w:rPr>
+        <w:rFonts w:hint="default"/>
+      </w:rPr>
+    </w:lvl>
+    <w:lvl w:ilvl="1" w:tplc="04090019" w:tentative="1">
+      <w:start w:val="1"/>
+      <w:numFmt w:val="upperLetter"/>
+      <w:lvlText w:val="%2."/>
+      <w:lvlJc w:val="left"/>
+      <w:pPr>
+        <w:ind w:left="1200" w:hanging="400"/>
+      </w:pPr>
+    </w:lvl>
+    <w:lvl w:ilvl="2" w:tplc="0409001B" w:tentative="1">
+      <w:start w:val="1"/>
+      <w:numFmt w:val="lowerRoman"/>
+      <w:lvlText w:val="%3."/>
+      <w:lvlJc w:val="right"/>
+      <w:pPr>
+        <w:ind w:left="1600" w:hanging="400"/>
+      </w:pPr>
+    </w:lvl>
+    <w:lvl w:ilvl="3" w:tplc="0409000F" w:tentative="1">
+      <w:start w:val="1"/>
+      <w:numFmt w:val="decimal"/>
+      <w:lvlText w:val="%4."/>
+      <w:lvlJc w:val="left"/>
+      <w:pPr>
+        <w:ind w:left="2000" w:hanging="400"/>
+      </w:pPr>
+    </w:lvl>
+    <w:lvl w:ilvl="4" w:tplc="04090019" w:tentative="1">
+      <w:start w:val="1"/>
+      <w:numFmt w:val="upperLetter"/>
+      <w:lvlText w:val="%5."/>
+      <w:lvlJc w:val="left"/>
+      <w:pPr>
+        <w:ind w:left="2400" w:hanging="400"/>
+      </w:pPr>
+    </w:lvl>
+    <w:lvl w:ilvl="5" w:tplc="0409001B" w:tentative="1">
+      <w:start w:val="1"/>
+      <w:numFmt w:val="lowerRoman"/>
+      <w:lvlText w:val="%6."/>
+      <w:lvlJc w:val="right"/>
+      <w:pPr>
+        <w:ind w:left="2800" w:hanging="400"/>
+      </w:pPr>
+    </w:lvl>
+    <w:lvl w:ilvl="6" w:tplc="0409000F" w:tentative="1">
+      <w:start w:val="1"/>
+      <w:numFmt w:val="decimal"/>
+      <w:lvlText w:val="%7."/>
+      <w:lvlJc w:val="left"/>
+      <w:pPr>
+        <w:ind w:left="3200" w:hanging="400"/>
+      </w:pPr>
+    </w:lvl>
+    <w:lvl w:ilvl="7" w:tplc="04090019" w:tentative="1">
+      <w:start w:val="1"/>
+      <w:numFmt w:val="upperLetter"/>
+      <w:lvlText w:val="%8."/>
+      <w:lvlJc w:val="left"/>
+      <w:pPr>
+        <w:ind w:left="3600" w:hanging="400"/>
+      </w:pPr>
+    </w:lvl>
+    <w:lvl w:ilvl="8" w:tplc="0409001B" w:tentative="1">
+      <w:start w:val="1"/>
+      <w:numFmt w:val="lowerRoman"/>
+      <w:lvlText w:val="%9."/>
+      <w:lvlJc w:val="right"/>
+      <w:pPr>
+        <w:ind w:left="4000" w:hanging="400"/>
+      </w:pPr>
+    </w:lvl>
+  </w:abstractNum>
+  <w:abstractNum w:abstractNumId="4" w15:restartNumberingAfterBreak="0">
     <w:nsid w:val="15B61E14"/>
     <w:multiLevelType w:val="hybridMultilevel"/>
     <w:tmpl w:val="196209A0"/>
@@ -9428,7 +11914,7 @@
       <w:lvlJc w:val="left"/>
     </w:lvl>
   </w:abstractNum>
-  <w:abstractNum w:abstractNumId="4" w15:restartNumberingAfterBreak="0">
+  <w:abstractNum w:abstractNumId="5" w15:restartNumberingAfterBreak="0">
     <w:nsid w:val="1BA52E66"/>
     <w:multiLevelType w:val="multilevel"/>
     <w:tmpl w:val="77DA6276"/>
@@ -9509,7 +11995,7 @@
       </w:rPr>
     </w:lvl>
   </w:abstractNum>
-  <w:abstractNum w:abstractNumId="5" w15:restartNumberingAfterBreak="0">
+  <w:abstractNum w:abstractNumId="6" w15:restartNumberingAfterBreak="0">
     <w:nsid w:val="6862322A"/>
     <w:multiLevelType w:val="multilevel"/>
     <w:tmpl w:val="492EFD7C"/>
@@ -9590,7 +12076,7 @@
       </w:rPr>
     </w:lvl>
   </w:abstractNum>
-  <w:abstractNum w:abstractNumId="6" w15:restartNumberingAfterBreak="0">
+  <w:abstractNum w:abstractNumId="7" w15:restartNumberingAfterBreak="0">
     <w:nsid w:val="6F207DE8"/>
     <w:multiLevelType w:val="multilevel"/>
     <w:tmpl w:val="1A382DB0"/>
@@ -9671,7 +12157,7 @@
       </w:rPr>
     </w:lvl>
   </w:abstractNum>
-  <w:abstractNum w:abstractNumId="7" w15:restartNumberingAfterBreak="0">
+  <w:abstractNum w:abstractNumId="8" w15:restartNumberingAfterBreak="0">
     <w:nsid w:val="73EA34D7"/>
     <w:multiLevelType w:val="multilevel"/>
     <w:tmpl w:val="C23E6152"/>
@@ -9752,7 +12238,7 @@
       </w:rPr>
     </w:lvl>
   </w:abstractNum>
-  <w:abstractNum w:abstractNumId="8" w15:restartNumberingAfterBreak="0">
+  <w:abstractNum w:abstractNumId="9" w15:restartNumberingAfterBreak="0">
     <w:nsid w:val="73F54F51"/>
     <w:multiLevelType w:val="multilevel"/>
     <w:tmpl w:val="2A1487A4"/>
@@ -9834,31 +12320,34 @@
     </w:lvl>
   </w:abstractNum>
   <w:num w:numId="1">
-    <w:abstractNumId w:val="3"/>
+    <w:abstractNumId w:val="4"/>
   </w:num>
   <w:num w:numId="2">
     <w:abstractNumId w:val="1"/>
   </w:num>
   <w:num w:numId="3">
-    <w:abstractNumId w:val="5"/>
+    <w:abstractNumId w:val="6"/>
   </w:num>
   <w:num w:numId="4">
     <w:abstractNumId w:val="2"/>
   </w:num>
   <w:num w:numId="5">
+    <w:abstractNumId w:val="9"/>
+  </w:num>
+  <w:num w:numId="6">
+    <w:abstractNumId w:val="5"/>
+  </w:num>
+  <w:num w:numId="7">
     <w:abstractNumId w:val="8"/>
   </w:num>
-  <w:num w:numId="6">
-    <w:abstractNumId w:val="4"/>
-  </w:num>
-  <w:num w:numId="7">
+  <w:num w:numId="8">
     <w:abstractNumId w:val="7"/>
-  </w:num>
-  <w:num w:numId="8">
-    <w:abstractNumId w:val="6"/>
   </w:num>
   <w:num w:numId="9">
     <w:abstractNumId w:val="0"/>
+  </w:num>
+  <w:num w:numId="10">
+    <w:abstractNumId w:val="3"/>
   </w:num>
 </w:numbering>
 </file>

</xml_diff>